<commit_message>
Ajustes reportes de colectivos
</commit_message>
<xml_diff>
--- a/Reportes/poliza_vida_2016.docx
+++ b/Reportes/poliza_vida_2016.docx
@@ -146,7 +146,10 @@
             <w:tcBorders>
               <w:top w:val="single" w:sz="4" w:space="0" w:color="auto"/>
               <w:left w:val="single" w:sz="4" w:space="0" w:color="auto"/>
+              <w:bottom w:val="nil"/>
+              <w:right w:val="nil"/>
             </w:tcBorders>
+            <w:vAlign w:val="center"/>
           </w:tcPr>
           <w:p>
             <w:pPr>
@@ -183,8 +186,11 @@
             <w:gridSpan w:val="3"/>
             <w:tcBorders>
               <w:top w:val="single" w:sz="4" w:space="0" w:color="auto"/>
+              <w:left w:val="nil"/>
+              <w:bottom w:val="nil"/>
               <w:right w:val="single" w:sz="8" w:space="0" w:color="auto"/>
             </w:tcBorders>
+            <w:vAlign w:val="center"/>
           </w:tcPr>
           <w:p>
             <w:pPr>
@@ -270,7 +276,10 @@
           <w:tcPr>
             <w:tcW w:w="1134" w:type="dxa"/>
             <w:tcBorders>
+              <w:top w:val="nil"/>
               <w:left w:val="single" w:sz="4" w:space="0" w:color="auto"/>
+              <w:bottom w:val="nil"/>
+              <w:right w:val="nil"/>
             </w:tcBorders>
             <w:vAlign w:val="center"/>
           </w:tcPr>
@@ -309,6 +318,9 @@
             <w:tcW w:w="7229" w:type="dxa"/>
             <w:gridSpan w:val="3"/>
             <w:tcBorders>
+              <w:top w:val="nil"/>
+              <w:left w:val="nil"/>
+              <w:bottom w:val="nil"/>
               <w:right w:val="single" w:sz="8" w:space="0" w:color="auto"/>
             </w:tcBorders>
             <w:vAlign w:val="center"/>
@@ -371,6 +383,7 @@
               <w:top w:val="single" w:sz="8" w:space="0" w:color="auto"/>
               <w:left w:val="single" w:sz="8" w:space="0" w:color="auto"/>
               <w:bottom w:val="nil"/>
+              <w:right w:val="nil"/>
             </w:tcBorders>
             <w:vAlign w:val="center"/>
           </w:tcPr>
@@ -399,6 +412,8 @@
             <w:tcW w:w="1708" w:type="dxa"/>
             <w:tcBorders>
               <w:top w:val="single" w:sz="8" w:space="0" w:color="auto"/>
+              <w:left w:val="nil"/>
+              <w:bottom w:val="nil"/>
               <w:right w:val="single" w:sz="4" w:space="0" w:color="auto"/>
             </w:tcBorders>
             <w:vAlign w:val="center"/>
@@ -459,7 +474,10 @@
           <w:tcPr>
             <w:tcW w:w="1134" w:type="dxa"/>
             <w:tcBorders>
+              <w:top w:val="nil"/>
               <w:left w:val="single" w:sz="4" w:space="0" w:color="auto"/>
+              <w:bottom w:val="nil"/>
+              <w:right w:val="nil"/>
             </w:tcBorders>
             <w:vAlign w:val="center"/>
           </w:tcPr>
@@ -486,6 +504,12 @@
         <w:tc>
           <w:tcPr>
             <w:tcW w:w="3260" w:type="dxa"/>
+            <w:tcBorders>
+              <w:top w:val="nil"/>
+              <w:left w:val="nil"/>
+              <w:bottom w:val="nil"/>
+              <w:right w:val="nil"/>
+            </w:tcBorders>
             <w:vAlign w:val="center"/>
           </w:tcPr>
           <w:p>
@@ -538,6 +562,12 @@
         <w:tc>
           <w:tcPr>
             <w:tcW w:w="1134" w:type="dxa"/>
+            <w:tcBorders>
+              <w:top w:val="nil"/>
+              <w:left w:val="nil"/>
+              <w:bottom w:val="nil"/>
+              <w:right w:val="nil"/>
+            </w:tcBorders>
             <w:vAlign w:val="center"/>
           </w:tcPr>
           <w:p>
@@ -554,10 +584,8 @@
               <w:rPr>
                 <w:rFonts w:ascii="Arial" w:hAnsi="Arial" w:cs="Arial"/>
                 <w:b/>
-                <w:bCs/>
-                <w:sz w:val="16"/>
-                <w:szCs w:val="16"/>
-                <w:lang w:val="es-PA"/>
+                <w:sz w:val="16"/>
+                <w:szCs w:val="16"/>
               </w:rPr>
               <w:t>Ced</w:t>
             </w:r>
@@ -566,10 +594,8 @@
               <w:rPr>
                 <w:rFonts w:ascii="Arial" w:hAnsi="Arial" w:cs="Arial"/>
                 <w:b/>
-                <w:bCs/>
-                <w:sz w:val="16"/>
-                <w:szCs w:val="16"/>
-                <w:lang w:val="es-PA"/>
+                <w:sz w:val="16"/>
+                <w:szCs w:val="16"/>
               </w:rPr>
               <w:t>/R.U.C:</w:t>
             </w:r>
@@ -579,6 +605,9 @@
           <w:tcPr>
             <w:tcW w:w="2835" w:type="dxa"/>
             <w:tcBorders>
+              <w:top w:val="nil"/>
+              <w:left w:val="nil"/>
+              <w:bottom w:val="nil"/>
               <w:right w:val="single" w:sz="8" w:space="0" w:color="auto"/>
             </w:tcBorders>
             <w:vAlign w:val="center"/>
@@ -643,6 +672,7 @@
               <w:top w:val="nil"/>
               <w:left w:val="single" w:sz="8" w:space="0" w:color="auto"/>
               <w:bottom w:val="nil"/>
+              <w:right w:val="nil"/>
             </w:tcBorders>
             <w:vAlign w:val="center"/>
           </w:tcPr>
@@ -670,28 +700,25 @@
           <w:tcPr>
             <w:tcW w:w="1708" w:type="dxa"/>
             <w:tcBorders>
+              <w:top w:val="nil"/>
+              <w:left w:val="nil"/>
+              <w:bottom w:val="nil"/>
               <w:right w:val="single" w:sz="4" w:space="0" w:color="auto"/>
             </w:tcBorders>
             <w:vAlign w:val="center"/>
           </w:tcPr>
           <w:p>
             <w:pPr>
-              <w:tabs>
-                <w:tab w:val="left" w:pos="528"/>
-                <w:tab w:val="left" w:pos="1848"/>
-              </w:tabs>
-              <w:spacing w:line="436" w:lineRule="auto"/>
-              <w:ind w:right="126"/>
-              <w:rPr>
-                <w:rFonts w:ascii="Arial" w:hAnsi="Arial" w:cs="Arial"/>
-                <w:sz w:val="16"/>
-                <w:szCs w:val="16"/>
-              </w:rPr>
-            </w:pPr>
-            <w:r>
-              <w:rPr>
-                <w:rFonts w:ascii="Arial" w:hAnsi="Arial" w:cs="Arial"/>
-                <w:spacing w:val="-2"/>
+              <w:pStyle w:val="Textoindependiente"/>
+              <w:rPr>
+                <w:rFonts w:ascii="Arial" w:hAnsi="Arial" w:cs="Arial"/>
+                <w:sz w:val="16"/>
+                <w:szCs w:val="16"/>
+              </w:rPr>
+            </w:pPr>
+            <w:r>
+              <w:rPr>
+                <w:rFonts w:ascii="Arial" w:hAnsi="Arial" w:cs="Arial"/>
                 <w:sz w:val="16"/>
                 <w:szCs w:val="16"/>
               </w:rPr>
@@ -702,27 +729,16 @@
             <w:r>
               <w:rPr>
                 <w:rFonts w:ascii="Arial" w:hAnsi="Arial" w:cs="Arial"/>
-                <w:spacing w:val="-2"/>
-                <w:sz w:val="16"/>
-                <w:szCs w:val="16"/>
-              </w:rPr>
-              <w:t>custom.</w:t>
-            </w:r>
-            <w:r>
-              <w:rPr>
-                <w:rFonts w:ascii="Arial" w:hAnsi="Arial" w:cs="Arial"/>
-                <w:spacing w:val="-2"/>
-                <w:sz w:val="16"/>
-                <w:szCs w:val="16"/>
-              </w:rPr>
-              <w:t>Hasta</w:t>
+                <w:sz w:val="16"/>
+                <w:szCs w:val="16"/>
+              </w:rPr>
+              <w:t>custom.Hasta</w:t>
             </w:r>
             <w:proofErr w:type="spellEnd"/>
             <w:proofErr w:type="gramEnd"/>
             <w:r>
               <w:rPr>
                 <w:rFonts w:ascii="Arial" w:hAnsi="Arial" w:cs="Arial"/>
-                <w:spacing w:val="-2"/>
                 <w:sz w:val="16"/>
                 <w:szCs w:val="16"/>
               </w:rPr>
@@ -739,7 +755,10 @@
           <w:tcPr>
             <w:tcW w:w="1134" w:type="dxa"/>
             <w:tcBorders>
+              <w:top w:val="nil"/>
               <w:left w:val="single" w:sz="4" w:space="0" w:color="auto"/>
+              <w:bottom w:val="nil"/>
+              <w:right w:val="nil"/>
             </w:tcBorders>
             <w:vAlign w:val="center"/>
           </w:tcPr>
@@ -759,13 +778,19 @@
                 <w:sz w:val="16"/>
                 <w:szCs w:val="16"/>
               </w:rPr>
-              <w:t>Fax:</w:t>
+              <w:t>País:</w:t>
             </w:r>
           </w:p>
         </w:tc>
         <w:tc>
           <w:tcPr>
             <w:tcW w:w="3260" w:type="dxa"/>
+            <w:tcBorders>
+              <w:top w:val="nil"/>
+              <w:left w:val="nil"/>
+              <w:bottom w:val="nil"/>
+              <w:right w:val="nil"/>
+            </w:tcBorders>
             <w:vAlign w:val="center"/>
           </w:tcPr>
           <w:p>
@@ -801,7 +826,7 @@
                 <w:sz w:val="16"/>
                 <w:szCs w:val="16"/>
               </w:rPr>
-              <w:t>Fax</w:t>
+              <w:t>Pais</w:t>
             </w:r>
             <w:proofErr w:type="spellEnd"/>
             <w:proofErr w:type="gramEnd"/>
@@ -818,6 +843,12 @@
         <w:tc>
           <w:tcPr>
             <w:tcW w:w="1134" w:type="dxa"/>
+            <w:tcBorders>
+              <w:top w:val="nil"/>
+              <w:left w:val="nil"/>
+              <w:bottom w:val="nil"/>
+              <w:right w:val="nil"/>
+            </w:tcBorders>
             <w:vAlign w:val="center"/>
           </w:tcPr>
           <w:p>
@@ -852,6 +883,9 @@
           <w:tcPr>
             <w:tcW w:w="2835" w:type="dxa"/>
             <w:tcBorders>
+              <w:top w:val="nil"/>
+              <w:left w:val="nil"/>
+              <w:bottom w:val="nil"/>
               <w:right w:val="single" w:sz="8" w:space="0" w:color="auto"/>
             </w:tcBorders>
             <w:vAlign w:val="center"/>
@@ -910,6 +944,7 @@
               <w:top w:val="nil"/>
               <w:left w:val="single" w:sz="8" w:space="0" w:color="auto"/>
               <w:bottom w:val="nil"/>
+              <w:right w:val="nil"/>
             </w:tcBorders>
             <w:vAlign w:val="center"/>
           </w:tcPr>
@@ -937,6 +972,9 @@
           <w:tcPr>
             <w:tcW w:w="1708" w:type="dxa"/>
             <w:tcBorders>
+              <w:top w:val="nil"/>
+              <w:left w:val="nil"/>
+              <w:bottom w:val="nil"/>
               <w:right w:val="single" w:sz="4" w:space="0" w:color="auto"/>
             </w:tcBorders>
             <w:vAlign w:val="center"/>
@@ -992,7 +1030,10 @@
           <w:tcPr>
             <w:tcW w:w="1134" w:type="dxa"/>
             <w:tcBorders>
+              <w:top w:val="nil"/>
               <w:left w:val="single" w:sz="4" w:space="0" w:color="auto"/>
+              <w:bottom w:val="nil"/>
+              <w:right w:val="nil"/>
             </w:tcBorders>
             <w:vAlign w:val="center"/>
           </w:tcPr>
@@ -1012,13 +1053,19 @@
                 <w:sz w:val="16"/>
                 <w:szCs w:val="16"/>
               </w:rPr>
-              <w:t>País:</w:t>
+              <w:t>Provincia:</w:t>
             </w:r>
           </w:p>
         </w:tc>
         <w:tc>
           <w:tcPr>
             <w:tcW w:w="3260" w:type="dxa"/>
+            <w:tcBorders>
+              <w:top w:val="nil"/>
+              <w:left w:val="nil"/>
+              <w:bottom w:val="nil"/>
+              <w:right w:val="nil"/>
+            </w:tcBorders>
             <w:vAlign w:val="center"/>
           </w:tcPr>
           <w:p>
@@ -1054,7 +1101,7 @@
                 <w:sz w:val="16"/>
                 <w:szCs w:val="16"/>
               </w:rPr>
-              <w:t>Pais</w:t>
+              <w:t>Provincia</w:t>
             </w:r>
             <w:proofErr w:type="spellEnd"/>
             <w:proofErr w:type="gramEnd"/>
@@ -1071,6 +1118,12 @@
         <w:tc>
           <w:tcPr>
             <w:tcW w:w="1134" w:type="dxa"/>
+            <w:tcBorders>
+              <w:top w:val="nil"/>
+              <w:left w:val="nil"/>
+              <w:bottom w:val="nil"/>
+              <w:right w:val="nil"/>
+            </w:tcBorders>
             <w:vAlign w:val="center"/>
           </w:tcPr>
           <w:p>
@@ -1105,6 +1158,9 @@
           <w:tcPr>
             <w:tcW w:w="2835" w:type="dxa"/>
             <w:tcBorders>
+              <w:top w:val="nil"/>
+              <w:left w:val="nil"/>
+              <w:bottom w:val="nil"/>
               <w:right w:val="single" w:sz="8" w:space="0" w:color="auto"/>
             </w:tcBorders>
             <w:vAlign w:val="center"/>
@@ -1163,6 +1219,7 @@
               <w:top w:val="nil"/>
               <w:left w:val="single" w:sz="8" w:space="0" w:color="auto"/>
               <w:bottom w:val="nil"/>
+              <w:right w:val="nil"/>
             </w:tcBorders>
           </w:tcPr>
           <w:p>
@@ -1180,6 +1237,9 @@
           <w:tcPr>
             <w:tcW w:w="1708" w:type="dxa"/>
             <w:tcBorders>
+              <w:top w:val="nil"/>
+              <w:left w:val="nil"/>
+              <w:bottom w:val="nil"/>
               <w:right w:val="single" w:sz="4" w:space="0" w:color="auto"/>
             </w:tcBorders>
           </w:tcPr>
@@ -1203,8 +1263,10 @@
           <w:tcPr>
             <w:tcW w:w="1134" w:type="dxa"/>
             <w:tcBorders>
+              <w:top w:val="nil"/>
               <w:left w:val="single" w:sz="4" w:space="0" w:color="auto"/>
               <w:bottom w:val="single" w:sz="4" w:space="0" w:color="auto"/>
+              <w:right w:val="nil"/>
             </w:tcBorders>
             <w:vAlign w:val="center"/>
           </w:tcPr>
@@ -1232,7 +1294,10 @@
           <w:tcPr>
             <w:tcW w:w="3260" w:type="dxa"/>
             <w:tcBorders>
+              <w:top w:val="nil"/>
+              <w:left w:val="nil"/>
               <w:bottom w:val="single" w:sz="4" w:space="0" w:color="auto"/>
+              <w:right w:val="nil"/>
             </w:tcBorders>
             <w:vAlign w:val="center"/>
           </w:tcPr>
@@ -1287,82 +1352,44 @@
           <w:tcPr>
             <w:tcW w:w="1134" w:type="dxa"/>
             <w:tcBorders>
+              <w:top w:val="nil"/>
+              <w:left w:val="nil"/>
               <w:bottom w:val="single" w:sz="4" w:space="0" w:color="auto"/>
+              <w:right w:val="nil"/>
             </w:tcBorders>
-          </w:tcPr>
-          <w:p>
-            <w:pPr>
-              <w:pStyle w:val="Textoindependiente"/>
-              <w:rPr>
-                <w:rFonts w:ascii="Arial" w:hAnsi="Arial" w:cs="Arial"/>
-                <w:sz w:val="16"/>
-                <w:szCs w:val="16"/>
-              </w:rPr>
-            </w:pPr>
-            <w:r>
-              <w:rPr>
-                <w:rFonts w:ascii="Arial" w:hAnsi="Arial" w:cs="Arial"/>
-                <w:b/>
-                <w:sz w:val="16"/>
-                <w:szCs w:val="16"/>
-              </w:rPr>
-              <w:t>Provincia:</w:t>
-            </w:r>
+            <w:vAlign w:val="center"/>
+          </w:tcPr>
+          <w:p>
+            <w:pPr>
+              <w:pStyle w:val="Textoindependiente"/>
+              <w:rPr>
+                <w:rFonts w:ascii="Arial" w:hAnsi="Arial" w:cs="Arial"/>
+                <w:sz w:val="16"/>
+                <w:szCs w:val="16"/>
+              </w:rPr>
+            </w:pPr>
           </w:p>
         </w:tc>
         <w:tc>
           <w:tcPr>
             <w:tcW w:w="2835" w:type="dxa"/>
             <w:tcBorders>
+              <w:top w:val="nil"/>
+              <w:left w:val="nil"/>
               <w:bottom w:val="single" w:sz="4" w:space="0" w:color="auto"/>
               <w:right w:val="single" w:sz="8" w:space="0" w:color="auto"/>
             </w:tcBorders>
-          </w:tcPr>
-          <w:p>
-            <w:pPr>
-              <w:pStyle w:val="Textoindependiente"/>
-              <w:rPr>
-                <w:rFonts w:ascii="Arial" w:hAnsi="Arial" w:cs="Arial"/>
-                <w:sz w:val="16"/>
-                <w:szCs w:val="16"/>
-              </w:rPr>
-            </w:pPr>
-            <w:r>
-              <w:rPr>
-                <w:rFonts w:ascii="Arial" w:hAnsi="Arial" w:cs="Arial"/>
-                <w:sz w:val="16"/>
-                <w:szCs w:val="16"/>
-              </w:rPr>
-              <w:t>{</w:t>
-            </w:r>
-            <w:proofErr w:type="spellStart"/>
-            <w:proofErr w:type="gramStart"/>
-            <w:r>
-              <w:rPr>
-                <w:rFonts w:ascii="Arial" w:hAnsi="Arial" w:cs="Arial"/>
-                <w:sz w:val="16"/>
-                <w:szCs w:val="16"/>
-              </w:rPr>
-              <w:t>custom.</w:t>
-            </w:r>
-            <w:r>
-              <w:rPr>
-                <w:rFonts w:ascii="Arial" w:hAnsi="Arial" w:cs="Arial"/>
-                <w:sz w:val="16"/>
-                <w:szCs w:val="16"/>
-              </w:rPr>
-              <w:t>Provincia</w:t>
-            </w:r>
-            <w:proofErr w:type="spellEnd"/>
-            <w:proofErr w:type="gramEnd"/>
-            <w:r>
-              <w:rPr>
-                <w:rFonts w:ascii="Arial" w:hAnsi="Arial" w:cs="Arial"/>
-                <w:sz w:val="16"/>
-                <w:szCs w:val="16"/>
-              </w:rPr>
-              <w:t>}</w:t>
-            </w:r>
+            <w:vAlign w:val="center"/>
+          </w:tcPr>
+          <w:p>
+            <w:pPr>
+              <w:pStyle w:val="Textoindependiente"/>
+              <w:rPr>
+                <w:rFonts w:ascii="Arial" w:hAnsi="Arial" w:cs="Arial"/>
+                <w:sz w:val="16"/>
+                <w:szCs w:val="16"/>
+              </w:rPr>
+            </w:pPr>
           </w:p>
         </w:tc>
         <w:tc>
@@ -1372,6 +1399,7 @@
               <w:top w:val="nil"/>
               <w:left w:val="single" w:sz="8" w:space="0" w:color="auto"/>
               <w:bottom w:val="single" w:sz="4" w:space="0" w:color="auto"/>
+              <w:right w:val="nil"/>
             </w:tcBorders>
           </w:tcPr>
           <w:p>
@@ -1389,6 +1417,8 @@
           <w:tcPr>
             <w:tcW w:w="1708" w:type="dxa"/>
             <w:tcBorders>
+              <w:top w:val="nil"/>
+              <w:left w:val="nil"/>
               <w:bottom w:val="single" w:sz="4" w:space="0" w:color="auto"/>
               <w:right w:val="single" w:sz="4" w:space="0" w:color="auto"/>
             </w:tcBorders>
@@ -2111,6 +2141,7 @@
             <w:tcBorders>
               <w:top w:val="nil"/>
               <w:left w:val="nil"/>
+              <w:bottom w:val="nil"/>
             </w:tcBorders>
           </w:tcPr>
           <w:p>
@@ -2216,6 +2247,7 @@
             <w:vMerge/>
             <w:tcBorders>
               <w:left w:val="nil"/>
+              <w:bottom w:val="nil"/>
             </w:tcBorders>
           </w:tcPr>
           <w:p>
@@ -2430,7 +2462,21 @@
       <w:pPr>
         <w:pStyle w:val="Textoindependiente"/>
         <w:spacing w:before="5"/>
-        <w:rPr>
+        <w:jc w:val="both"/>
+        <w:rPr>
+          <w:rFonts w:ascii="Arial" w:hAnsi="Arial" w:cs="Arial"/>
+          <w:sz w:val="16"/>
+          <w:szCs w:val="16"/>
+        </w:rPr>
+      </w:pPr>
+    </w:p>
+    <w:p>
+      <w:pPr>
+        <w:pStyle w:val="Textoindependiente"/>
+        <w:spacing w:before="5"/>
+        <w:jc w:val="both"/>
+        <w:rPr>
+          <w:rFonts w:ascii="Arial" w:hAnsi="Arial" w:cs="Arial"/>
           <w:sz w:val="4"/>
           <w:szCs w:val="4"/>
         </w:rPr>
@@ -2441,6 +2487,10 @@
         <w:tblStyle w:val="Tablaconcuadrcula"/>
         <w:tblW w:w="0" w:type="auto"/>
         <w:tblInd w:w="392" w:type="dxa"/>
+        <w:tblBorders>
+          <w:insideH w:val="none" w:sz="0" w:space="0" w:color="auto"/>
+          <w:insideV w:val="none" w:sz="0" w:space="0" w:color="auto"/>
+        </w:tblBorders>
         <w:tblLayout w:type="fixed"/>
         <w:tblLook w:val="04A0" w:firstRow="1" w:lastRow="0" w:firstColumn="1" w:lastColumn="0" w:noHBand="0" w:noVBand="1"/>
       </w:tblPr>
@@ -2457,1095 +2507,33 @@
           </w:tcPr>
           <w:p>
             <w:pPr>
-              <w:pStyle w:val="Textoindependiente"/>
-              <w:spacing w:before="42" w:line="348" w:lineRule="auto"/>
-              <w:ind w:left="19" w:right="23"/>
+              <w:widowControl/>
+              <w:suppressAutoHyphens/>
+              <w:adjustRightInd w:val="0"/>
+              <w:spacing w:line="276" w:lineRule="auto"/>
               <w:jc w:val="both"/>
               <w:rPr>
-                <w:rFonts w:ascii="Arial" w:hAnsi="Arial" w:cs="Arial"/>
-                <w:sz w:val="16"/>
-                <w:szCs w:val="16"/>
-              </w:rPr>
-            </w:pPr>
-            <w:r>
-              <w:rPr>
-                <w:rFonts w:ascii="Arial" w:hAnsi="Arial" w:cs="Arial"/>
-                <w:w w:val="105"/>
-                <w:sz w:val="16"/>
-                <w:szCs w:val="16"/>
-              </w:rPr>
-              <w:t>Causales</w:t>
-            </w:r>
-            <w:r>
-              <w:rPr>
-                <w:rFonts w:ascii="Arial" w:hAnsi="Arial" w:cs="Arial"/>
-                <w:spacing w:val="40"/>
-                <w:w w:val="105"/>
-                <w:sz w:val="16"/>
-                <w:szCs w:val="16"/>
-              </w:rPr>
-              <w:t xml:space="preserve"> </w:t>
-            </w:r>
-            <w:r>
-              <w:rPr>
-                <w:rFonts w:ascii="Arial" w:hAnsi="Arial" w:cs="Arial"/>
-                <w:w w:val="105"/>
-                <w:sz w:val="16"/>
-                <w:szCs w:val="16"/>
-              </w:rPr>
-              <w:t>de</w:t>
-            </w:r>
-            <w:r>
-              <w:rPr>
-                <w:rFonts w:ascii="Arial" w:hAnsi="Arial" w:cs="Arial"/>
-                <w:spacing w:val="40"/>
-                <w:w w:val="105"/>
-                <w:sz w:val="16"/>
-                <w:szCs w:val="16"/>
-              </w:rPr>
-              <w:t xml:space="preserve"> </w:t>
-            </w:r>
-            <w:r>
-              <w:rPr>
-                <w:rFonts w:ascii="Arial" w:hAnsi="Arial" w:cs="Arial"/>
-                <w:w w:val="105"/>
-                <w:sz w:val="16"/>
-                <w:szCs w:val="16"/>
-              </w:rPr>
-              <w:t>Terminación</w:t>
-            </w:r>
-            <w:r>
-              <w:rPr>
-                <w:rFonts w:ascii="Arial" w:hAnsi="Arial" w:cs="Arial"/>
-                <w:spacing w:val="40"/>
-                <w:w w:val="105"/>
-                <w:sz w:val="16"/>
-                <w:szCs w:val="16"/>
-              </w:rPr>
-              <w:t xml:space="preserve"> </w:t>
-            </w:r>
-            <w:r>
-              <w:rPr>
-                <w:rFonts w:ascii="Arial" w:hAnsi="Arial" w:cs="Arial"/>
-                <w:w w:val="105"/>
-                <w:sz w:val="16"/>
-                <w:szCs w:val="16"/>
-              </w:rPr>
-              <w:t>del</w:t>
-            </w:r>
-            <w:r>
-              <w:rPr>
-                <w:rFonts w:ascii="Arial" w:hAnsi="Arial" w:cs="Arial"/>
-                <w:spacing w:val="40"/>
-                <w:w w:val="105"/>
-                <w:sz w:val="16"/>
-                <w:szCs w:val="16"/>
-              </w:rPr>
-              <w:t xml:space="preserve"> </w:t>
-            </w:r>
-            <w:r>
-              <w:rPr>
-                <w:rFonts w:ascii="Arial" w:hAnsi="Arial" w:cs="Arial"/>
-                <w:w w:val="105"/>
-                <w:sz w:val="16"/>
-                <w:szCs w:val="16"/>
-              </w:rPr>
-              <w:t>Contrato:</w:t>
-            </w:r>
-            <w:r>
-              <w:rPr>
-                <w:rFonts w:ascii="Arial" w:hAnsi="Arial" w:cs="Arial"/>
-                <w:spacing w:val="40"/>
-                <w:w w:val="105"/>
-                <w:sz w:val="16"/>
-                <w:szCs w:val="16"/>
-              </w:rPr>
-              <w:t xml:space="preserve"> </w:t>
-            </w:r>
-            <w:r>
-              <w:rPr>
-                <w:rFonts w:ascii="Arial" w:hAnsi="Arial" w:cs="Arial"/>
-                <w:w w:val="105"/>
-                <w:sz w:val="16"/>
-                <w:szCs w:val="16"/>
-              </w:rPr>
-              <w:t>Unilateralmente</w:t>
-            </w:r>
-            <w:r>
-              <w:rPr>
-                <w:rFonts w:ascii="Arial" w:hAnsi="Arial" w:cs="Arial"/>
-                <w:spacing w:val="40"/>
-                <w:w w:val="105"/>
-                <w:sz w:val="16"/>
-                <w:szCs w:val="16"/>
-              </w:rPr>
-              <w:t xml:space="preserve"> </w:t>
-            </w:r>
-            <w:r>
-              <w:rPr>
-                <w:rFonts w:ascii="Arial" w:hAnsi="Arial" w:cs="Arial"/>
-                <w:w w:val="105"/>
-                <w:sz w:val="16"/>
-                <w:szCs w:val="16"/>
-              </w:rPr>
-              <w:t>por</w:t>
-            </w:r>
-            <w:r>
-              <w:rPr>
-                <w:rFonts w:ascii="Arial" w:hAnsi="Arial" w:cs="Arial"/>
-                <w:spacing w:val="40"/>
-                <w:w w:val="105"/>
-                <w:sz w:val="16"/>
-                <w:szCs w:val="16"/>
-              </w:rPr>
-              <w:t xml:space="preserve"> </w:t>
-            </w:r>
-            <w:r>
-              <w:rPr>
-                <w:rFonts w:ascii="Arial" w:hAnsi="Arial" w:cs="Arial"/>
-                <w:w w:val="105"/>
-                <w:sz w:val="16"/>
-                <w:szCs w:val="16"/>
-              </w:rPr>
-              <w:t>las</w:t>
-            </w:r>
-            <w:r>
-              <w:rPr>
-                <w:rFonts w:ascii="Arial" w:hAnsi="Arial" w:cs="Arial"/>
-                <w:spacing w:val="40"/>
-                <w:w w:val="105"/>
-                <w:sz w:val="16"/>
-                <w:szCs w:val="16"/>
-              </w:rPr>
-              <w:t xml:space="preserve"> </w:t>
-            </w:r>
-            <w:r>
-              <w:rPr>
-                <w:rFonts w:ascii="Arial" w:hAnsi="Arial" w:cs="Arial"/>
-                <w:w w:val="105"/>
-                <w:sz w:val="16"/>
-                <w:szCs w:val="16"/>
-              </w:rPr>
-              <w:t>partes,</w:t>
-            </w:r>
-            <w:r>
-              <w:rPr>
-                <w:rFonts w:ascii="Arial" w:hAnsi="Arial" w:cs="Arial"/>
-                <w:spacing w:val="40"/>
-                <w:w w:val="105"/>
-                <w:sz w:val="16"/>
-                <w:szCs w:val="16"/>
-              </w:rPr>
-              <w:t xml:space="preserve"> </w:t>
-            </w:r>
-            <w:r>
-              <w:rPr>
-                <w:rFonts w:ascii="Arial" w:hAnsi="Arial" w:cs="Arial"/>
-                <w:w w:val="105"/>
-                <w:sz w:val="16"/>
-                <w:szCs w:val="16"/>
-              </w:rPr>
-              <w:t>dando</w:t>
-            </w:r>
-            <w:r>
-              <w:rPr>
-                <w:rFonts w:ascii="Arial" w:hAnsi="Arial" w:cs="Arial"/>
-                <w:spacing w:val="40"/>
-                <w:w w:val="105"/>
-                <w:sz w:val="16"/>
-                <w:szCs w:val="16"/>
-              </w:rPr>
-              <w:t xml:space="preserve"> </w:t>
-            </w:r>
-            <w:r>
-              <w:rPr>
-                <w:rFonts w:ascii="Arial" w:hAnsi="Arial" w:cs="Arial"/>
-                <w:w w:val="105"/>
-                <w:sz w:val="16"/>
-                <w:szCs w:val="16"/>
-              </w:rPr>
-              <w:t>aviso</w:t>
-            </w:r>
-            <w:r>
-              <w:rPr>
-                <w:rFonts w:ascii="Arial" w:hAnsi="Arial" w:cs="Arial"/>
-                <w:spacing w:val="40"/>
-                <w:w w:val="105"/>
-                <w:sz w:val="16"/>
-                <w:szCs w:val="16"/>
-              </w:rPr>
-              <w:t xml:space="preserve"> </w:t>
-            </w:r>
-            <w:r>
-              <w:rPr>
-                <w:rFonts w:ascii="Arial" w:hAnsi="Arial" w:cs="Arial"/>
-                <w:w w:val="105"/>
-                <w:sz w:val="16"/>
-                <w:szCs w:val="16"/>
-              </w:rPr>
-              <w:t>por</w:t>
-            </w:r>
-            <w:r>
-              <w:rPr>
-                <w:rFonts w:ascii="Arial" w:hAnsi="Arial" w:cs="Arial"/>
-                <w:spacing w:val="40"/>
-                <w:w w:val="105"/>
-                <w:sz w:val="16"/>
-                <w:szCs w:val="16"/>
-              </w:rPr>
-              <w:t xml:space="preserve"> </w:t>
-            </w:r>
-            <w:r>
-              <w:rPr>
-                <w:rFonts w:ascii="Arial" w:hAnsi="Arial" w:cs="Arial"/>
-                <w:w w:val="105"/>
-                <w:sz w:val="16"/>
-                <w:szCs w:val="16"/>
-              </w:rPr>
-              <w:t>escrito</w:t>
-            </w:r>
-            <w:r>
-              <w:rPr>
-                <w:rFonts w:ascii="Arial" w:hAnsi="Arial" w:cs="Arial"/>
-                <w:spacing w:val="40"/>
-                <w:w w:val="105"/>
-                <w:sz w:val="16"/>
-                <w:szCs w:val="16"/>
-              </w:rPr>
-              <w:t xml:space="preserve"> </w:t>
-            </w:r>
-            <w:r>
-              <w:rPr>
-                <w:rFonts w:ascii="Arial" w:hAnsi="Arial" w:cs="Arial"/>
-                <w:w w:val="105"/>
-                <w:sz w:val="16"/>
-                <w:szCs w:val="16"/>
-              </w:rPr>
-              <w:t>mediante</w:t>
-            </w:r>
-            <w:r>
-              <w:rPr>
-                <w:rFonts w:ascii="Arial" w:hAnsi="Arial" w:cs="Arial"/>
-                <w:spacing w:val="40"/>
-                <w:w w:val="105"/>
-                <w:sz w:val="16"/>
-                <w:szCs w:val="16"/>
-              </w:rPr>
-              <w:t xml:space="preserve"> </w:t>
-            </w:r>
-            <w:r>
-              <w:rPr>
-                <w:rFonts w:ascii="Arial" w:hAnsi="Arial" w:cs="Arial"/>
-                <w:w w:val="105"/>
-                <w:sz w:val="16"/>
-                <w:szCs w:val="16"/>
-              </w:rPr>
-              <w:t>correo</w:t>
-            </w:r>
-            <w:r>
-              <w:rPr>
-                <w:rFonts w:ascii="Arial" w:hAnsi="Arial" w:cs="Arial"/>
-                <w:spacing w:val="40"/>
-                <w:w w:val="105"/>
-                <w:sz w:val="16"/>
-                <w:szCs w:val="16"/>
-              </w:rPr>
-              <w:t xml:space="preserve"> </w:t>
-            </w:r>
-            <w:r>
-              <w:rPr>
-                <w:rFonts w:ascii="Arial" w:hAnsi="Arial" w:cs="Arial"/>
-                <w:w w:val="105"/>
-                <w:sz w:val="16"/>
-                <w:szCs w:val="16"/>
-              </w:rPr>
-              <w:t>certificado</w:t>
-            </w:r>
-            <w:r>
-              <w:rPr>
-                <w:rFonts w:ascii="Arial" w:hAnsi="Arial" w:cs="Arial"/>
-                <w:spacing w:val="40"/>
-                <w:w w:val="105"/>
-                <w:sz w:val="16"/>
-                <w:szCs w:val="16"/>
-              </w:rPr>
-              <w:t xml:space="preserve"> </w:t>
-            </w:r>
-            <w:r>
-              <w:rPr>
-                <w:rFonts w:ascii="Arial" w:hAnsi="Arial" w:cs="Arial"/>
-                <w:w w:val="105"/>
-                <w:sz w:val="16"/>
-                <w:szCs w:val="16"/>
-              </w:rPr>
-              <w:t>o</w:t>
-            </w:r>
-            <w:r>
-              <w:rPr>
-                <w:rFonts w:ascii="Arial" w:hAnsi="Arial" w:cs="Arial"/>
-                <w:spacing w:val="40"/>
-                <w:w w:val="105"/>
-                <w:sz w:val="16"/>
-                <w:szCs w:val="16"/>
-              </w:rPr>
-              <w:t xml:space="preserve"> </w:t>
-            </w:r>
-            <w:r>
-              <w:rPr>
-                <w:rFonts w:ascii="Arial" w:hAnsi="Arial" w:cs="Arial"/>
-                <w:w w:val="105"/>
-                <w:sz w:val="16"/>
-                <w:szCs w:val="16"/>
-              </w:rPr>
-              <w:t>por</w:t>
-            </w:r>
-            <w:r>
-              <w:rPr>
-                <w:rFonts w:ascii="Arial" w:hAnsi="Arial" w:cs="Arial"/>
-                <w:spacing w:val="40"/>
-                <w:w w:val="105"/>
-                <w:sz w:val="16"/>
-                <w:szCs w:val="16"/>
-              </w:rPr>
-              <w:t xml:space="preserve"> </w:t>
-            </w:r>
-            <w:r>
-              <w:rPr>
-                <w:rFonts w:ascii="Arial" w:hAnsi="Arial" w:cs="Arial"/>
-                <w:w w:val="105"/>
-                <w:sz w:val="16"/>
-                <w:szCs w:val="16"/>
-              </w:rPr>
-              <w:t>entrega</w:t>
-            </w:r>
-            <w:r>
-              <w:rPr>
-                <w:rFonts w:ascii="Arial" w:hAnsi="Arial" w:cs="Arial"/>
-                <w:spacing w:val="40"/>
-                <w:w w:val="105"/>
-                <w:sz w:val="16"/>
-                <w:szCs w:val="16"/>
-              </w:rPr>
-              <w:t xml:space="preserve"> </w:t>
-            </w:r>
-            <w:r>
-              <w:rPr>
-                <w:rFonts w:ascii="Arial" w:hAnsi="Arial" w:cs="Arial"/>
-                <w:w w:val="105"/>
-                <w:sz w:val="16"/>
-                <w:szCs w:val="16"/>
-              </w:rPr>
-              <w:t>directa</w:t>
-            </w:r>
-            <w:r>
-              <w:rPr>
-                <w:rFonts w:ascii="Arial" w:hAnsi="Arial" w:cs="Arial"/>
-                <w:spacing w:val="40"/>
-                <w:w w:val="105"/>
-                <w:sz w:val="16"/>
-                <w:szCs w:val="16"/>
-              </w:rPr>
-              <w:t xml:space="preserve"> </w:t>
-            </w:r>
-            <w:r>
-              <w:rPr>
-                <w:rFonts w:ascii="Arial" w:hAnsi="Arial" w:cs="Arial"/>
-                <w:w w:val="105"/>
-                <w:sz w:val="16"/>
-                <w:szCs w:val="16"/>
-              </w:rPr>
-              <w:t>de</w:t>
-            </w:r>
-            <w:r>
-              <w:rPr>
-                <w:rFonts w:ascii="Arial" w:hAnsi="Arial" w:cs="Arial"/>
-                <w:spacing w:val="40"/>
-                <w:w w:val="105"/>
-                <w:sz w:val="16"/>
-                <w:szCs w:val="16"/>
-              </w:rPr>
-              <w:t xml:space="preserve"> </w:t>
-            </w:r>
-            <w:r>
-              <w:rPr>
-                <w:rFonts w:ascii="Arial" w:hAnsi="Arial" w:cs="Arial"/>
-                <w:w w:val="105"/>
-                <w:sz w:val="16"/>
-                <w:szCs w:val="16"/>
-              </w:rPr>
-              <w:t>la</w:t>
-            </w:r>
-            <w:r>
-              <w:rPr>
-                <w:rFonts w:ascii="Arial" w:hAnsi="Arial" w:cs="Arial"/>
-                <w:spacing w:val="40"/>
-                <w:w w:val="105"/>
-                <w:sz w:val="16"/>
-                <w:szCs w:val="16"/>
-              </w:rPr>
-              <w:t xml:space="preserve"> </w:t>
-            </w:r>
-            <w:r>
-              <w:rPr>
-                <w:rFonts w:ascii="Arial" w:hAnsi="Arial" w:cs="Arial"/>
-                <w:w w:val="105"/>
-                <w:sz w:val="16"/>
-                <w:szCs w:val="16"/>
-              </w:rPr>
-              <w:t>comunicación.</w:t>
-            </w:r>
-            <w:r>
-              <w:rPr>
-                <w:rFonts w:ascii="Arial" w:hAnsi="Arial" w:cs="Arial"/>
-                <w:spacing w:val="40"/>
-                <w:w w:val="105"/>
-                <w:sz w:val="16"/>
-                <w:szCs w:val="16"/>
-              </w:rPr>
-              <w:t xml:space="preserve"> </w:t>
-            </w:r>
-            <w:r>
-              <w:rPr>
-                <w:rFonts w:ascii="Arial" w:hAnsi="Arial" w:cs="Arial"/>
-                <w:w w:val="105"/>
-                <w:sz w:val="16"/>
-                <w:szCs w:val="16"/>
-              </w:rPr>
-              <w:t>En</w:t>
-            </w:r>
-            <w:r>
-              <w:rPr>
-                <w:rFonts w:ascii="Arial" w:hAnsi="Arial" w:cs="Arial"/>
-                <w:spacing w:val="40"/>
-                <w:w w:val="105"/>
-                <w:sz w:val="16"/>
-                <w:szCs w:val="16"/>
-              </w:rPr>
-              <w:t xml:space="preserve"> </w:t>
-            </w:r>
-            <w:r>
-              <w:rPr>
-                <w:rFonts w:ascii="Arial" w:hAnsi="Arial" w:cs="Arial"/>
-                <w:w w:val="105"/>
-                <w:sz w:val="16"/>
-                <w:szCs w:val="16"/>
-              </w:rPr>
-              <w:t>el</w:t>
-            </w:r>
-            <w:r>
-              <w:rPr>
-                <w:rFonts w:ascii="Arial" w:hAnsi="Arial" w:cs="Arial"/>
-                <w:spacing w:val="40"/>
-                <w:w w:val="105"/>
-                <w:sz w:val="16"/>
-                <w:szCs w:val="16"/>
-              </w:rPr>
-              <w:t xml:space="preserve"> </w:t>
-            </w:r>
-            <w:r>
-              <w:rPr>
-                <w:rFonts w:ascii="Arial" w:hAnsi="Arial" w:cs="Arial"/>
-                <w:w w:val="105"/>
-                <w:sz w:val="16"/>
-                <w:szCs w:val="16"/>
-              </w:rPr>
-              <w:t>caso</w:t>
-            </w:r>
-            <w:r>
-              <w:rPr>
-                <w:rFonts w:ascii="Arial" w:hAnsi="Arial" w:cs="Arial"/>
-                <w:spacing w:val="40"/>
-                <w:w w:val="105"/>
-                <w:sz w:val="16"/>
-                <w:szCs w:val="16"/>
-              </w:rPr>
-              <w:t xml:space="preserve"> </w:t>
-            </w:r>
-            <w:r>
-              <w:rPr>
-                <w:rFonts w:ascii="Arial" w:hAnsi="Arial" w:cs="Arial"/>
-                <w:w w:val="105"/>
-                <w:sz w:val="16"/>
-                <w:szCs w:val="16"/>
-              </w:rPr>
-              <w:t>de</w:t>
-            </w:r>
-            <w:r>
-              <w:rPr>
-                <w:rFonts w:ascii="Arial" w:hAnsi="Arial" w:cs="Arial"/>
-                <w:spacing w:val="40"/>
-                <w:w w:val="105"/>
-                <w:sz w:val="16"/>
-                <w:szCs w:val="16"/>
-              </w:rPr>
-              <w:t xml:space="preserve"> </w:t>
-            </w:r>
-            <w:r>
-              <w:rPr>
-                <w:rFonts w:ascii="Arial" w:hAnsi="Arial" w:cs="Arial"/>
-                <w:w w:val="105"/>
-                <w:sz w:val="16"/>
-                <w:szCs w:val="16"/>
-              </w:rPr>
-              <w:t>cancelación</w:t>
-            </w:r>
-            <w:r>
-              <w:rPr>
-                <w:rFonts w:ascii="Arial" w:hAnsi="Arial" w:cs="Arial"/>
-                <w:spacing w:val="40"/>
-                <w:w w:val="105"/>
-                <w:sz w:val="16"/>
-                <w:szCs w:val="16"/>
-              </w:rPr>
-              <w:t xml:space="preserve"> </w:t>
-            </w:r>
-            <w:r>
-              <w:rPr>
-                <w:rFonts w:ascii="Arial" w:hAnsi="Arial" w:cs="Arial"/>
-                <w:w w:val="105"/>
-                <w:sz w:val="16"/>
-                <w:szCs w:val="16"/>
-              </w:rPr>
-              <w:t>por</w:t>
-            </w:r>
-            <w:r>
-              <w:rPr>
-                <w:rFonts w:ascii="Arial" w:hAnsi="Arial" w:cs="Arial"/>
-                <w:spacing w:val="40"/>
-                <w:w w:val="105"/>
-                <w:sz w:val="16"/>
-                <w:szCs w:val="16"/>
-              </w:rPr>
-              <w:t xml:space="preserve"> </w:t>
-            </w:r>
-            <w:r>
-              <w:rPr>
-                <w:rFonts w:ascii="Arial" w:hAnsi="Arial" w:cs="Arial"/>
-                <w:w w:val="105"/>
-                <w:sz w:val="16"/>
-                <w:szCs w:val="16"/>
-              </w:rPr>
-              <w:t>parte</w:t>
-            </w:r>
-            <w:r>
-              <w:rPr>
-                <w:rFonts w:ascii="Arial" w:hAnsi="Arial" w:cs="Arial"/>
-                <w:spacing w:val="40"/>
-                <w:w w:val="105"/>
-                <w:sz w:val="16"/>
-                <w:szCs w:val="16"/>
-              </w:rPr>
-              <w:t xml:space="preserve"> </w:t>
-            </w:r>
-            <w:r>
-              <w:rPr>
-                <w:rFonts w:ascii="Arial" w:hAnsi="Arial" w:cs="Arial"/>
-                <w:w w:val="105"/>
-                <w:sz w:val="16"/>
-                <w:szCs w:val="16"/>
-              </w:rPr>
-              <w:t>de</w:t>
-            </w:r>
-            <w:r>
-              <w:rPr>
-                <w:rFonts w:ascii="Arial" w:hAnsi="Arial" w:cs="Arial"/>
-                <w:spacing w:val="40"/>
-                <w:w w:val="105"/>
-                <w:sz w:val="16"/>
-                <w:szCs w:val="16"/>
-              </w:rPr>
-              <w:t xml:space="preserve"> </w:t>
-            </w:r>
-            <w:r>
-              <w:rPr>
-                <w:rFonts w:ascii="Arial" w:hAnsi="Arial" w:cs="Arial"/>
-                <w:w w:val="105"/>
-                <w:sz w:val="16"/>
-                <w:szCs w:val="16"/>
-              </w:rPr>
-              <w:t>la</w:t>
-            </w:r>
-            <w:r>
-              <w:rPr>
-                <w:rFonts w:ascii="Arial" w:hAnsi="Arial" w:cs="Arial"/>
-                <w:spacing w:val="40"/>
-                <w:w w:val="105"/>
-                <w:sz w:val="16"/>
-                <w:szCs w:val="16"/>
-              </w:rPr>
-              <w:t xml:space="preserve"> </w:t>
-            </w:r>
-            <w:r>
-              <w:rPr>
-                <w:rFonts w:ascii="Arial" w:hAnsi="Arial" w:cs="Arial"/>
-                <w:w w:val="105"/>
-                <w:sz w:val="16"/>
-                <w:szCs w:val="16"/>
-              </w:rPr>
-              <w:t>Aseguradora,</w:t>
-            </w:r>
-            <w:r>
-              <w:rPr>
-                <w:rFonts w:ascii="Arial" w:hAnsi="Arial" w:cs="Arial"/>
-                <w:spacing w:val="40"/>
-                <w:w w:val="105"/>
-                <w:sz w:val="16"/>
-                <w:szCs w:val="16"/>
-              </w:rPr>
-              <w:t xml:space="preserve"> </w:t>
-            </w:r>
-            <w:r>
-              <w:rPr>
-                <w:rFonts w:ascii="Arial" w:hAnsi="Arial" w:cs="Arial"/>
-                <w:w w:val="105"/>
-                <w:sz w:val="16"/>
-                <w:szCs w:val="16"/>
-              </w:rPr>
-              <w:t>la</w:t>
-            </w:r>
-            <w:r>
-              <w:rPr>
-                <w:rFonts w:ascii="Arial" w:hAnsi="Arial" w:cs="Arial"/>
-                <w:spacing w:val="40"/>
-                <w:w w:val="105"/>
-                <w:sz w:val="16"/>
-                <w:szCs w:val="16"/>
-              </w:rPr>
-              <w:t xml:space="preserve"> </w:t>
-            </w:r>
-            <w:r>
-              <w:rPr>
-                <w:rFonts w:ascii="Arial" w:hAnsi="Arial" w:cs="Arial"/>
-                <w:w w:val="105"/>
-                <w:sz w:val="16"/>
-                <w:szCs w:val="16"/>
-              </w:rPr>
-              <w:t>cobertura</w:t>
-            </w:r>
-            <w:r>
-              <w:rPr>
-                <w:rFonts w:ascii="Arial" w:hAnsi="Arial" w:cs="Arial"/>
-                <w:spacing w:val="40"/>
-                <w:w w:val="105"/>
-                <w:sz w:val="16"/>
-                <w:szCs w:val="16"/>
-              </w:rPr>
-              <w:t xml:space="preserve"> </w:t>
-            </w:r>
-            <w:r>
-              <w:rPr>
-                <w:rFonts w:ascii="Arial" w:hAnsi="Arial" w:cs="Arial"/>
-                <w:w w:val="105"/>
-                <w:sz w:val="16"/>
-                <w:szCs w:val="16"/>
-              </w:rPr>
-              <w:t>y</w:t>
-            </w:r>
-            <w:r>
-              <w:rPr>
-                <w:rFonts w:ascii="Arial" w:hAnsi="Arial" w:cs="Arial"/>
-                <w:spacing w:val="40"/>
-                <w:w w:val="105"/>
-                <w:sz w:val="16"/>
-                <w:szCs w:val="16"/>
-              </w:rPr>
-              <w:t xml:space="preserve"> </w:t>
-            </w:r>
-            <w:r>
-              <w:rPr>
-                <w:rFonts w:ascii="Arial" w:hAnsi="Arial" w:cs="Arial"/>
-                <w:w w:val="105"/>
-                <w:sz w:val="16"/>
-                <w:szCs w:val="16"/>
-              </w:rPr>
-              <w:t>el</w:t>
-            </w:r>
-            <w:r>
-              <w:rPr>
-                <w:rFonts w:ascii="Arial" w:hAnsi="Arial" w:cs="Arial"/>
-                <w:spacing w:val="40"/>
-                <w:w w:val="105"/>
-                <w:sz w:val="16"/>
-                <w:szCs w:val="16"/>
-              </w:rPr>
-              <w:t xml:space="preserve"> </w:t>
-            </w:r>
-            <w:r>
-              <w:rPr>
-                <w:rFonts w:ascii="Arial" w:hAnsi="Arial" w:cs="Arial"/>
-                <w:w w:val="105"/>
-                <w:sz w:val="16"/>
-                <w:szCs w:val="16"/>
-              </w:rPr>
-              <w:t>pago</w:t>
-            </w:r>
-            <w:r>
-              <w:rPr>
-                <w:rFonts w:ascii="Arial" w:hAnsi="Arial" w:cs="Arial"/>
-                <w:spacing w:val="40"/>
-                <w:w w:val="105"/>
-                <w:sz w:val="16"/>
-                <w:szCs w:val="16"/>
-              </w:rPr>
-              <w:t xml:space="preserve"> </w:t>
-            </w:r>
-            <w:r>
-              <w:rPr>
-                <w:rFonts w:ascii="Arial" w:hAnsi="Arial" w:cs="Arial"/>
-                <w:w w:val="105"/>
-                <w:sz w:val="16"/>
-                <w:szCs w:val="16"/>
-              </w:rPr>
-              <w:t>de</w:t>
-            </w:r>
-            <w:r>
-              <w:rPr>
-                <w:rFonts w:ascii="Arial" w:hAnsi="Arial" w:cs="Arial"/>
-                <w:spacing w:val="40"/>
-                <w:w w:val="105"/>
-                <w:sz w:val="16"/>
-                <w:szCs w:val="16"/>
-              </w:rPr>
-              <w:t xml:space="preserve"> </w:t>
-            </w:r>
-            <w:r>
-              <w:rPr>
-                <w:rFonts w:ascii="Arial" w:hAnsi="Arial" w:cs="Arial"/>
-                <w:w w:val="105"/>
-                <w:sz w:val="16"/>
-                <w:szCs w:val="16"/>
-              </w:rPr>
-              <w:t>la</w:t>
-            </w:r>
-            <w:r>
-              <w:rPr>
-                <w:rFonts w:ascii="Arial" w:hAnsi="Arial" w:cs="Arial"/>
-                <w:spacing w:val="40"/>
-                <w:w w:val="105"/>
-                <w:sz w:val="16"/>
-                <w:szCs w:val="16"/>
-              </w:rPr>
-              <w:t xml:space="preserve"> </w:t>
-            </w:r>
-            <w:r>
-              <w:rPr>
-                <w:rFonts w:ascii="Arial" w:hAnsi="Arial" w:cs="Arial"/>
-                <w:w w:val="105"/>
-                <w:sz w:val="16"/>
-                <w:szCs w:val="16"/>
-              </w:rPr>
-              <w:t>prima</w:t>
-            </w:r>
-            <w:r>
-              <w:rPr>
-                <w:rFonts w:ascii="Arial" w:hAnsi="Arial" w:cs="Arial"/>
-                <w:spacing w:val="40"/>
-                <w:w w:val="105"/>
-                <w:sz w:val="16"/>
-                <w:szCs w:val="16"/>
-              </w:rPr>
-              <w:t xml:space="preserve"> </w:t>
-            </w:r>
-            <w:r>
-              <w:rPr>
-                <w:rFonts w:ascii="Arial" w:hAnsi="Arial" w:cs="Arial"/>
-                <w:w w:val="105"/>
-                <w:sz w:val="16"/>
-                <w:szCs w:val="16"/>
-              </w:rPr>
-              <w:t>cesarán</w:t>
-            </w:r>
-            <w:r>
-              <w:rPr>
-                <w:rFonts w:ascii="Arial" w:hAnsi="Arial" w:cs="Arial"/>
-                <w:spacing w:val="40"/>
-                <w:w w:val="105"/>
-                <w:sz w:val="16"/>
-                <w:szCs w:val="16"/>
-              </w:rPr>
-              <w:t xml:space="preserve"> </w:t>
-            </w:r>
-            <w:r>
-              <w:rPr>
-                <w:rFonts w:ascii="Arial" w:hAnsi="Arial" w:cs="Arial"/>
-                <w:w w:val="105"/>
-                <w:sz w:val="16"/>
-                <w:szCs w:val="16"/>
-              </w:rPr>
-              <w:t>10</w:t>
-            </w:r>
-            <w:r>
-              <w:rPr>
-                <w:rFonts w:ascii="Arial" w:hAnsi="Arial" w:cs="Arial"/>
-                <w:spacing w:val="40"/>
-                <w:w w:val="105"/>
-                <w:sz w:val="16"/>
-                <w:szCs w:val="16"/>
-              </w:rPr>
-              <w:t xml:space="preserve"> </w:t>
-            </w:r>
-            <w:r>
-              <w:rPr>
-                <w:rFonts w:ascii="Arial" w:hAnsi="Arial" w:cs="Arial"/>
-                <w:w w:val="105"/>
-                <w:sz w:val="16"/>
-                <w:szCs w:val="16"/>
-              </w:rPr>
-              <w:t>días</w:t>
-            </w:r>
-            <w:r>
-              <w:rPr>
-                <w:rFonts w:ascii="Arial" w:hAnsi="Arial" w:cs="Arial"/>
-                <w:spacing w:val="40"/>
-                <w:w w:val="105"/>
-                <w:sz w:val="16"/>
-                <w:szCs w:val="16"/>
-              </w:rPr>
-              <w:t xml:space="preserve"> </w:t>
-            </w:r>
-            <w:r>
-              <w:rPr>
-                <w:rFonts w:ascii="Arial" w:hAnsi="Arial" w:cs="Arial"/>
-                <w:w w:val="105"/>
-                <w:sz w:val="16"/>
-                <w:szCs w:val="16"/>
-              </w:rPr>
-              <w:t>calendarios</w:t>
-            </w:r>
-            <w:r>
-              <w:rPr>
-                <w:rFonts w:ascii="Arial" w:hAnsi="Arial" w:cs="Arial"/>
-                <w:spacing w:val="40"/>
-                <w:w w:val="105"/>
-                <w:sz w:val="16"/>
-                <w:szCs w:val="16"/>
-              </w:rPr>
-              <w:t xml:space="preserve"> </w:t>
-            </w:r>
-            <w:r>
-              <w:rPr>
-                <w:rFonts w:ascii="Arial" w:hAnsi="Arial" w:cs="Arial"/>
-                <w:w w:val="105"/>
-                <w:sz w:val="16"/>
-                <w:szCs w:val="16"/>
-              </w:rPr>
-              <w:t>posteriores</w:t>
-            </w:r>
-            <w:r>
-              <w:rPr>
-                <w:rFonts w:ascii="Arial" w:hAnsi="Arial" w:cs="Arial"/>
-                <w:spacing w:val="40"/>
-                <w:w w:val="105"/>
-                <w:sz w:val="16"/>
-                <w:szCs w:val="16"/>
-              </w:rPr>
-              <w:t xml:space="preserve"> </w:t>
-            </w:r>
-            <w:r>
-              <w:rPr>
-                <w:rFonts w:ascii="Arial" w:hAnsi="Arial" w:cs="Arial"/>
-                <w:w w:val="105"/>
-                <w:sz w:val="16"/>
-                <w:szCs w:val="16"/>
-              </w:rPr>
-              <w:t>a</w:t>
-            </w:r>
-            <w:r>
-              <w:rPr>
-                <w:rFonts w:ascii="Arial" w:hAnsi="Arial" w:cs="Arial"/>
-                <w:spacing w:val="40"/>
-                <w:w w:val="105"/>
-                <w:sz w:val="16"/>
-                <w:szCs w:val="16"/>
-              </w:rPr>
-              <w:t xml:space="preserve"> </w:t>
-            </w:r>
-            <w:r>
-              <w:rPr>
-                <w:rFonts w:ascii="Arial" w:hAnsi="Arial" w:cs="Arial"/>
-                <w:w w:val="105"/>
-                <w:sz w:val="16"/>
-                <w:szCs w:val="16"/>
-              </w:rPr>
-              <w:t>la</w:t>
-            </w:r>
-            <w:r>
-              <w:rPr>
-                <w:rFonts w:ascii="Arial" w:hAnsi="Arial" w:cs="Arial"/>
-                <w:spacing w:val="40"/>
-                <w:w w:val="105"/>
-                <w:sz w:val="16"/>
-                <w:szCs w:val="16"/>
-              </w:rPr>
-              <w:t xml:space="preserve"> </w:t>
-            </w:r>
-            <w:r>
-              <w:rPr>
-                <w:rFonts w:ascii="Arial" w:hAnsi="Arial" w:cs="Arial"/>
-                <w:w w:val="105"/>
-                <w:sz w:val="16"/>
-                <w:szCs w:val="16"/>
-              </w:rPr>
-              <w:t>notificación,</w:t>
-            </w:r>
-            <w:r>
-              <w:rPr>
-                <w:rFonts w:ascii="Arial" w:hAnsi="Arial" w:cs="Arial"/>
-                <w:spacing w:val="40"/>
-                <w:w w:val="105"/>
-                <w:sz w:val="16"/>
-                <w:szCs w:val="16"/>
-              </w:rPr>
-              <w:t xml:space="preserve"> </w:t>
-            </w:r>
-            <w:r>
-              <w:rPr>
-                <w:rFonts w:ascii="Arial" w:hAnsi="Arial" w:cs="Arial"/>
-                <w:w w:val="105"/>
-                <w:sz w:val="16"/>
-                <w:szCs w:val="16"/>
-              </w:rPr>
-              <w:t>en</w:t>
-            </w:r>
-            <w:r>
-              <w:rPr>
-                <w:rFonts w:ascii="Arial" w:hAnsi="Arial" w:cs="Arial"/>
-                <w:spacing w:val="40"/>
-                <w:w w:val="105"/>
-                <w:sz w:val="16"/>
-                <w:szCs w:val="16"/>
-              </w:rPr>
-              <w:t xml:space="preserve"> </w:t>
-            </w:r>
-            <w:r>
-              <w:rPr>
-                <w:rFonts w:ascii="Arial" w:hAnsi="Arial" w:cs="Arial"/>
-                <w:w w:val="105"/>
-                <w:sz w:val="16"/>
-                <w:szCs w:val="16"/>
-              </w:rPr>
-              <w:t>el</w:t>
-            </w:r>
-            <w:r>
-              <w:rPr>
-                <w:rFonts w:ascii="Arial" w:hAnsi="Arial" w:cs="Arial"/>
-                <w:spacing w:val="40"/>
-                <w:w w:val="105"/>
-                <w:sz w:val="16"/>
-                <w:szCs w:val="16"/>
-              </w:rPr>
-              <w:t xml:space="preserve"> </w:t>
-            </w:r>
-            <w:r>
-              <w:rPr>
-                <w:rFonts w:ascii="Arial" w:hAnsi="Arial" w:cs="Arial"/>
-                <w:w w:val="105"/>
-                <w:sz w:val="16"/>
-                <w:szCs w:val="16"/>
-              </w:rPr>
-              <w:t>caso</w:t>
-            </w:r>
-            <w:r>
-              <w:rPr>
-                <w:rFonts w:ascii="Arial" w:hAnsi="Arial" w:cs="Arial"/>
-                <w:spacing w:val="40"/>
-                <w:w w:val="105"/>
-                <w:sz w:val="16"/>
-                <w:szCs w:val="16"/>
-              </w:rPr>
-              <w:t xml:space="preserve"> </w:t>
-            </w:r>
-            <w:r>
-              <w:rPr>
-                <w:rFonts w:ascii="Arial" w:hAnsi="Arial" w:cs="Arial"/>
-                <w:w w:val="105"/>
-                <w:sz w:val="16"/>
-                <w:szCs w:val="16"/>
-              </w:rPr>
-              <w:t>que</w:t>
-            </w:r>
-            <w:r>
-              <w:rPr>
-                <w:rFonts w:ascii="Arial" w:hAnsi="Arial" w:cs="Arial"/>
-                <w:spacing w:val="40"/>
-                <w:w w:val="105"/>
-                <w:sz w:val="16"/>
-                <w:szCs w:val="16"/>
-              </w:rPr>
-              <w:t xml:space="preserve"> </w:t>
-            </w:r>
-            <w:r>
-              <w:rPr>
-                <w:rFonts w:ascii="Arial" w:hAnsi="Arial" w:cs="Arial"/>
-                <w:w w:val="105"/>
-                <w:sz w:val="16"/>
-                <w:szCs w:val="16"/>
-              </w:rPr>
-              <w:t>EL</w:t>
-            </w:r>
-            <w:r>
-              <w:rPr>
-                <w:rFonts w:ascii="Arial" w:hAnsi="Arial" w:cs="Arial"/>
-                <w:spacing w:val="40"/>
-                <w:w w:val="105"/>
-                <w:sz w:val="16"/>
-                <w:szCs w:val="16"/>
-              </w:rPr>
-              <w:t xml:space="preserve"> </w:t>
-            </w:r>
-            <w:r>
-              <w:rPr>
-                <w:rFonts w:ascii="Arial" w:hAnsi="Arial" w:cs="Arial"/>
-                <w:w w:val="105"/>
-                <w:sz w:val="16"/>
-                <w:szCs w:val="16"/>
-              </w:rPr>
-              <w:t>ASEGURADO</w:t>
-            </w:r>
-            <w:r>
-              <w:rPr>
-                <w:rFonts w:ascii="Arial" w:hAnsi="Arial" w:cs="Arial"/>
-                <w:spacing w:val="40"/>
-                <w:w w:val="105"/>
-                <w:sz w:val="16"/>
-                <w:szCs w:val="16"/>
-              </w:rPr>
-              <w:t xml:space="preserve"> </w:t>
-            </w:r>
-            <w:r>
-              <w:rPr>
-                <w:rFonts w:ascii="Arial" w:hAnsi="Arial" w:cs="Arial"/>
-                <w:w w:val="105"/>
-                <w:sz w:val="16"/>
-                <w:szCs w:val="16"/>
-              </w:rPr>
-              <w:t>decida</w:t>
-            </w:r>
-            <w:r>
-              <w:rPr>
-                <w:rFonts w:ascii="Arial" w:hAnsi="Arial" w:cs="Arial"/>
-                <w:spacing w:val="40"/>
-                <w:w w:val="105"/>
-                <w:sz w:val="16"/>
-                <w:szCs w:val="16"/>
-              </w:rPr>
-              <w:t xml:space="preserve"> </w:t>
-            </w:r>
-            <w:r>
-              <w:rPr>
-                <w:rFonts w:ascii="Arial" w:hAnsi="Arial" w:cs="Arial"/>
-                <w:w w:val="105"/>
-                <w:sz w:val="16"/>
-                <w:szCs w:val="16"/>
-              </w:rPr>
-              <w:t>cancelar, dicha cancelación sufrirá efecto el día siguiente a la notificación de cancelación.</w:t>
-            </w:r>
-          </w:p>
-          <w:p>
-            <w:pPr>
-              <w:pStyle w:val="Textoindependiente"/>
-              <w:spacing w:before="6"/>
-              <w:ind w:left="19"/>
+                <w:rFonts w:ascii="Arial" w:eastAsiaTheme="minorHAnsi" w:hAnsi="Arial" w:cs="Arial"/>
+                <w:color w:val="000000"/>
+                <w:sz w:val="16"/>
+                <w:szCs w:val="16"/>
+                <w:lang w:val="es-NI"/>
+              </w:rPr>
+            </w:pPr>
+            <w:r>
+              <w:rPr>
+                <w:rFonts w:ascii="Arial" w:eastAsiaTheme="minorHAnsi" w:hAnsi="Arial" w:cs="Arial"/>
+                <w:color w:val="000000"/>
+                <w:sz w:val="16"/>
+                <w:szCs w:val="16"/>
+                <w:lang w:val="es-NI"/>
+              </w:rPr>
+              <w:t>Causales de Terminación del Contrato: Unilateralmente por las partes, dando aviso por escrito mediante correo certificado o por entrega directa de la comunicación. En el caso de cancelación por parte de la Aseguradora, la cobertura y el pago de la prima cesarán 10 días calendarios posteriores a la notificación, en el caso que EL ASEGURADO decida cancelar, dicha cancelación sufrirá efecto el día siguiente a la notificación de cancelación.</w:t>
+            </w:r>
+          </w:p>
+          <w:p>
+            <w:pPr>
+              <w:pStyle w:val="Textoindependiente"/>
               <w:jc w:val="both"/>
               <w:rPr>
                 <w:rFonts w:ascii="Arial" w:hAnsi="Arial" w:cs="Arial"/>
@@ -3555,440 +2543,36 @@
             </w:pPr>
             <w:r>
               <w:rPr>
-                <w:rFonts w:ascii="Arial" w:hAnsi="Arial" w:cs="Arial"/>
-                <w:w w:val="105"/>
-                <w:sz w:val="16"/>
-                <w:szCs w:val="16"/>
-              </w:rPr>
-              <w:t>Queda</w:t>
-            </w:r>
-            <w:r>
-              <w:rPr>
-                <w:rFonts w:ascii="Arial" w:hAnsi="Arial" w:cs="Arial"/>
-                <w:spacing w:val="68"/>
-                <w:w w:val="105"/>
-                <w:sz w:val="16"/>
-                <w:szCs w:val="16"/>
-              </w:rPr>
-              <w:t xml:space="preserve"> </w:t>
-            </w:r>
-            <w:r>
-              <w:rPr>
-                <w:rFonts w:ascii="Arial" w:hAnsi="Arial" w:cs="Arial"/>
-                <w:w w:val="105"/>
-                <w:sz w:val="16"/>
-                <w:szCs w:val="16"/>
-              </w:rPr>
-              <w:t>entendido</w:t>
-            </w:r>
-            <w:r>
-              <w:rPr>
-                <w:rFonts w:ascii="Arial" w:hAnsi="Arial" w:cs="Arial"/>
-                <w:spacing w:val="69"/>
-                <w:w w:val="105"/>
-                <w:sz w:val="16"/>
-                <w:szCs w:val="16"/>
-              </w:rPr>
-              <w:t xml:space="preserve"> </w:t>
-            </w:r>
-            <w:r>
-              <w:rPr>
-                <w:rFonts w:ascii="Arial" w:hAnsi="Arial" w:cs="Arial"/>
-                <w:w w:val="105"/>
-                <w:sz w:val="16"/>
-                <w:szCs w:val="16"/>
-              </w:rPr>
-              <w:t>y</w:t>
-            </w:r>
-            <w:r>
-              <w:rPr>
-                <w:rFonts w:ascii="Arial" w:hAnsi="Arial" w:cs="Arial"/>
-                <w:spacing w:val="68"/>
-                <w:w w:val="105"/>
-                <w:sz w:val="16"/>
-                <w:szCs w:val="16"/>
-              </w:rPr>
-              <w:t xml:space="preserve"> </w:t>
-            </w:r>
-            <w:r>
-              <w:rPr>
-                <w:rFonts w:ascii="Arial" w:hAnsi="Arial" w:cs="Arial"/>
-                <w:w w:val="105"/>
-                <w:sz w:val="16"/>
-                <w:szCs w:val="16"/>
-              </w:rPr>
-              <w:t>acordado</w:t>
-            </w:r>
-            <w:r>
-              <w:rPr>
-                <w:rFonts w:ascii="Arial" w:hAnsi="Arial" w:cs="Arial"/>
-                <w:spacing w:val="69"/>
-                <w:w w:val="105"/>
-                <w:sz w:val="16"/>
-                <w:szCs w:val="16"/>
-              </w:rPr>
-              <w:t xml:space="preserve"> </w:t>
-            </w:r>
-            <w:r>
-              <w:rPr>
-                <w:rFonts w:ascii="Arial" w:hAnsi="Arial" w:cs="Arial"/>
-                <w:w w:val="105"/>
-                <w:sz w:val="16"/>
-                <w:szCs w:val="16"/>
-              </w:rPr>
-              <w:t>que</w:t>
-            </w:r>
-            <w:r>
-              <w:rPr>
-                <w:rFonts w:ascii="Arial" w:hAnsi="Arial" w:cs="Arial"/>
-                <w:spacing w:val="69"/>
-                <w:w w:val="105"/>
-                <w:sz w:val="16"/>
-                <w:szCs w:val="16"/>
-              </w:rPr>
-              <w:t xml:space="preserve"> </w:t>
-            </w:r>
-            <w:r>
-              <w:rPr>
-                <w:rFonts w:ascii="Arial" w:hAnsi="Arial" w:cs="Arial"/>
-                <w:w w:val="105"/>
-                <w:sz w:val="16"/>
-                <w:szCs w:val="16"/>
-              </w:rPr>
-              <w:t>el</w:t>
-            </w:r>
-            <w:r>
-              <w:rPr>
-                <w:rFonts w:ascii="Arial" w:hAnsi="Arial" w:cs="Arial"/>
-                <w:spacing w:val="66"/>
-                <w:w w:val="105"/>
-                <w:sz w:val="16"/>
-                <w:szCs w:val="16"/>
-              </w:rPr>
-              <w:t xml:space="preserve"> </w:t>
-            </w:r>
-            <w:r>
-              <w:rPr>
-                <w:rFonts w:ascii="Arial" w:hAnsi="Arial" w:cs="Arial"/>
-                <w:w w:val="105"/>
-                <w:sz w:val="16"/>
-                <w:szCs w:val="16"/>
-              </w:rPr>
-              <w:t>Tomador,</w:t>
-            </w:r>
-            <w:r>
-              <w:rPr>
-                <w:rFonts w:ascii="Arial" w:hAnsi="Arial" w:cs="Arial"/>
-                <w:spacing w:val="69"/>
-                <w:w w:val="105"/>
-                <w:sz w:val="16"/>
-                <w:szCs w:val="16"/>
-              </w:rPr>
-              <w:t xml:space="preserve"> </w:t>
-            </w:r>
-            <w:r>
-              <w:rPr>
-                <w:rFonts w:ascii="Arial" w:hAnsi="Arial" w:cs="Arial"/>
-                <w:w w:val="105"/>
-                <w:sz w:val="16"/>
-                <w:szCs w:val="16"/>
-              </w:rPr>
-              <w:t>El</w:t>
-            </w:r>
-            <w:r>
-              <w:rPr>
-                <w:rFonts w:ascii="Arial" w:hAnsi="Arial" w:cs="Arial"/>
-                <w:spacing w:val="62"/>
-                <w:w w:val="105"/>
-                <w:sz w:val="16"/>
-                <w:szCs w:val="16"/>
-              </w:rPr>
-              <w:t xml:space="preserve"> </w:t>
-            </w:r>
-            <w:r>
-              <w:rPr>
-                <w:rFonts w:ascii="Arial" w:hAnsi="Arial" w:cs="Arial"/>
-                <w:w w:val="105"/>
-                <w:sz w:val="16"/>
-                <w:szCs w:val="16"/>
-              </w:rPr>
-              <w:t>Asegurado</w:t>
-            </w:r>
-            <w:r>
-              <w:rPr>
-                <w:rFonts w:ascii="Arial" w:hAnsi="Arial" w:cs="Arial"/>
-                <w:spacing w:val="69"/>
-                <w:w w:val="105"/>
-                <w:sz w:val="16"/>
-                <w:szCs w:val="16"/>
-              </w:rPr>
-              <w:t xml:space="preserve"> </w:t>
-            </w:r>
-            <w:r>
-              <w:rPr>
-                <w:rFonts w:ascii="Arial" w:hAnsi="Arial" w:cs="Arial"/>
-                <w:w w:val="105"/>
-                <w:sz w:val="16"/>
-                <w:szCs w:val="16"/>
-              </w:rPr>
-              <w:t>y</w:t>
-            </w:r>
-            <w:r>
-              <w:rPr>
-                <w:rFonts w:ascii="Arial" w:hAnsi="Arial" w:cs="Arial"/>
-                <w:spacing w:val="63"/>
-                <w:w w:val="105"/>
-                <w:sz w:val="16"/>
-                <w:szCs w:val="16"/>
-              </w:rPr>
-              <w:t xml:space="preserve"> </w:t>
-            </w:r>
-            <w:r>
-              <w:rPr>
-                <w:rFonts w:ascii="Arial" w:hAnsi="Arial" w:cs="Arial"/>
-                <w:w w:val="105"/>
-                <w:sz w:val="16"/>
-                <w:szCs w:val="16"/>
-              </w:rPr>
-              <w:t>Aseguradora</w:t>
-            </w:r>
-            <w:r>
-              <w:rPr>
-                <w:rFonts w:ascii="Arial" w:hAnsi="Arial" w:cs="Arial"/>
-                <w:spacing w:val="69"/>
-                <w:w w:val="105"/>
-                <w:sz w:val="16"/>
-                <w:szCs w:val="16"/>
-              </w:rPr>
-              <w:t xml:space="preserve"> </w:t>
-            </w:r>
-            <w:r>
-              <w:rPr>
-                <w:rFonts w:ascii="Arial" w:hAnsi="Arial" w:cs="Arial"/>
-                <w:w w:val="105"/>
-                <w:sz w:val="16"/>
-                <w:szCs w:val="16"/>
-              </w:rPr>
-              <w:t>Global</w:t>
-            </w:r>
-            <w:r>
-              <w:rPr>
-                <w:rFonts w:ascii="Arial" w:hAnsi="Arial" w:cs="Arial"/>
-                <w:spacing w:val="70"/>
-                <w:w w:val="105"/>
-                <w:sz w:val="16"/>
-                <w:szCs w:val="16"/>
-              </w:rPr>
-              <w:t xml:space="preserve"> </w:t>
-            </w:r>
-            <w:r>
-              <w:rPr>
-                <w:rFonts w:ascii="Arial" w:hAnsi="Arial" w:cs="Arial"/>
-                <w:w w:val="105"/>
-                <w:sz w:val="16"/>
-                <w:szCs w:val="16"/>
-              </w:rPr>
-              <w:t>S.A.</w:t>
-            </w:r>
-            <w:r>
-              <w:rPr>
-                <w:rFonts w:ascii="Arial" w:hAnsi="Arial" w:cs="Arial"/>
-                <w:spacing w:val="69"/>
-                <w:w w:val="105"/>
-                <w:sz w:val="16"/>
-                <w:szCs w:val="16"/>
-              </w:rPr>
-              <w:t xml:space="preserve"> </w:t>
-            </w:r>
-            <w:r>
-              <w:rPr>
-                <w:rFonts w:ascii="Arial" w:hAnsi="Arial" w:cs="Arial"/>
-                <w:w w:val="105"/>
-                <w:sz w:val="16"/>
-                <w:szCs w:val="16"/>
-              </w:rPr>
-              <w:t>han</w:t>
-            </w:r>
-            <w:r>
-              <w:rPr>
-                <w:rFonts w:ascii="Arial" w:hAnsi="Arial" w:cs="Arial"/>
-                <w:spacing w:val="70"/>
-                <w:w w:val="105"/>
-                <w:sz w:val="16"/>
-                <w:szCs w:val="16"/>
-              </w:rPr>
-              <w:t xml:space="preserve"> </w:t>
-            </w:r>
-            <w:r>
-              <w:rPr>
-                <w:rFonts w:ascii="Arial" w:hAnsi="Arial" w:cs="Arial"/>
-                <w:w w:val="105"/>
-                <w:sz w:val="16"/>
-                <w:szCs w:val="16"/>
-              </w:rPr>
-              <w:t>convenido</w:t>
-            </w:r>
-            <w:r>
-              <w:rPr>
-                <w:rFonts w:ascii="Arial" w:hAnsi="Arial" w:cs="Arial"/>
-                <w:spacing w:val="69"/>
-                <w:w w:val="105"/>
-                <w:sz w:val="16"/>
-                <w:szCs w:val="16"/>
-              </w:rPr>
-              <w:t xml:space="preserve"> </w:t>
-            </w:r>
-            <w:r>
-              <w:rPr>
-                <w:rFonts w:ascii="Arial" w:hAnsi="Arial" w:cs="Arial"/>
-                <w:w w:val="105"/>
-                <w:sz w:val="16"/>
-                <w:szCs w:val="16"/>
-              </w:rPr>
-              <w:t>y</w:t>
-            </w:r>
-            <w:r>
-              <w:rPr>
-                <w:rFonts w:ascii="Arial" w:hAnsi="Arial" w:cs="Arial"/>
-                <w:spacing w:val="70"/>
-                <w:w w:val="105"/>
-                <w:sz w:val="16"/>
-                <w:szCs w:val="16"/>
-              </w:rPr>
-              <w:t xml:space="preserve"> </w:t>
-            </w:r>
-            <w:r>
-              <w:rPr>
-                <w:rFonts w:ascii="Arial" w:hAnsi="Arial" w:cs="Arial"/>
-                <w:w w:val="105"/>
-                <w:sz w:val="16"/>
-                <w:szCs w:val="16"/>
-              </w:rPr>
-              <w:t>aceptado</w:t>
-            </w:r>
-            <w:r>
-              <w:rPr>
-                <w:rFonts w:ascii="Arial" w:hAnsi="Arial" w:cs="Arial"/>
-                <w:spacing w:val="70"/>
-                <w:w w:val="105"/>
-                <w:sz w:val="16"/>
-                <w:szCs w:val="16"/>
-              </w:rPr>
-              <w:t xml:space="preserve"> </w:t>
-            </w:r>
-            <w:r>
-              <w:rPr>
-                <w:rFonts w:ascii="Arial" w:hAnsi="Arial" w:cs="Arial"/>
-                <w:w w:val="105"/>
-                <w:sz w:val="16"/>
-                <w:szCs w:val="16"/>
-              </w:rPr>
-              <w:t>las</w:t>
-            </w:r>
-            <w:r>
-              <w:rPr>
-                <w:rFonts w:ascii="Arial" w:hAnsi="Arial" w:cs="Arial"/>
-                <w:spacing w:val="69"/>
-                <w:w w:val="105"/>
-                <w:sz w:val="16"/>
-                <w:szCs w:val="16"/>
-              </w:rPr>
-              <w:t xml:space="preserve"> </w:t>
-            </w:r>
-            <w:r>
-              <w:rPr>
-                <w:rFonts w:ascii="Arial" w:hAnsi="Arial" w:cs="Arial"/>
-                <w:w w:val="105"/>
-                <w:sz w:val="16"/>
-                <w:szCs w:val="16"/>
-              </w:rPr>
-              <w:t>Condiciones</w:t>
-            </w:r>
-            <w:r>
-              <w:rPr>
-                <w:rFonts w:ascii="Arial" w:hAnsi="Arial" w:cs="Arial"/>
-                <w:spacing w:val="70"/>
-                <w:w w:val="105"/>
-                <w:sz w:val="16"/>
-                <w:szCs w:val="16"/>
-              </w:rPr>
-              <w:t xml:space="preserve"> </w:t>
-            </w:r>
-            <w:r>
-              <w:rPr>
-                <w:rFonts w:ascii="Arial" w:hAnsi="Arial" w:cs="Arial"/>
-                <w:w w:val="105"/>
-                <w:sz w:val="16"/>
-                <w:szCs w:val="16"/>
-              </w:rPr>
-              <w:t>Particulares,</w:t>
-            </w:r>
-            <w:r>
-              <w:rPr>
-                <w:rFonts w:ascii="Arial" w:hAnsi="Arial" w:cs="Arial"/>
-                <w:spacing w:val="70"/>
-                <w:w w:val="105"/>
-                <w:sz w:val="16"/>
-                <w:szCs w:val="16"/>
-              </w:rPr>
-              <w:t xml:space="preserve"> </w:t>
-            </w:r>
-            <w:r>
-              <w:rPr>
-                <w:rFonts w:ascii="Arial" w:hAnsi="Arial" w:cs="Arial"/>
-                <w:w w:val="105"/>
-                <w:sz w:val="16"/>
-                <w:szCs w:val="16"/>
-              </w:rPr>
-              <w:t>Condiciones</w:t>
-            </w:r>
-            <w:r>
-              <w:rPr>
-                <w:rFonts w:ascii="Arial" w:hAnsi="Arial" w:cs="Arial"/>
-                <w:spacing w:val="69"/>
-                <w:w w:val="105"/>
-                <w:sz w:val="16"/>
-                <w:szCs w:val="16"/>
-              </w:rPr>
-              <w:t xml:space="preserve"> </w:t>
-            </w:r>
-            <w:r>
-              <w:rPr>
-                <w:rFonts w:ascii="Arial" w:hAnsi="Arial" w:cs="Arial"/>
-                <w:w w:val="105"/>
-                <w:sz w:val="16"/>
-                <w:szCs w:val="16"/>
-              </w:rPr>
-              <w:t>Generales</w:t>
-            </w:r>
-            <w:r>
-              <w:rPr>
-                <w:rFonts w:ascii="Arial" w:hAnsi="Arial" w:cs="Arial"/>
-                <w:spacing w:val="70"/>
-                <w:w w:val="105"/>
-                <w:sz w:val="16"/>
-                <w:szCs w:val="16"/>
-              </w:rPr>
-              <w:t xml:space="preserve"> </w:t>
-            </w:r>
-            <w:r>
-              <w:rPr>
-                <w:rFonts w:ascii="Arial" w:hAnsi="Arial" w:cs="Arial"/>
-                <w:spacing w:val="-10"/>
-                <w:w w:val="105"/>
-                <w:sz w:val="16"/>
-                <w:szCs w:val="16"/>
-              </w:rPr>
-              <w:t>y</w:t>
-            </w:r>
-          </w:p>
-          <w:p>
-            <w:pPr>
-              <w:pStyle w:val="Textoindependiente"/>
-              <w:rPr>
-                <w:sz w:val="14"/>
-              </w:rPr>
-            </w:pPr>
+                <w:rFonts w:ascii="Arial" w:eastAsiaTheme="minorHAnsi" w:hAnsi="Arial" w:cs="Arial"/>
+                <w:color w:val="000000"/>
+                <w:sz w:val="16"/>
+                <w:szCs w:val="16"/>
+                <w:lang w:val="es-NI"/>
+              </w:rPr>
+              <w:t xml:space="preserve">Queda entendido y acordado que el Tomador, El Asegurado y Aseguradora Global S.A. han convenido y aceptado las </w:t>
+            </w:r>
+            <w:proofErr w:type="gramStart"/>
+            <w:r>
+              <w:rPr>
+                <w:rFonts w:ascii="Arial" w:eastAsiaTheme="minorHAnsi" w:hAnsi="Arial" w:cs="Arial"/>
+                <w:color w:val="000000"/>
+                <w:sz w:val="16"/>
+                <w:szCs w:val="16"/>
+                <w:lang w:val="es-NI"/>
+              </w:rPr>
+              <w:t>Condiciones  Particulares</w:t>
+            </w:r>
+            <w:proofErr w:type="gramEnd"/>
+            <w:r>
+              <w:rPr>
+                <w:rFonts w:ascii="Arial" w:eastAsiaTheme="minorHAnsi" w:hAnsi="Arial" w:cs="Arial"/>
+                <w:color w:val="000000"/>
+                <w:sz w:val="16"/>
+                <w:szCs w:val="16"/>
+                <w:lang w:val="es-NI"/>
+              </w:rPr>
+              <w:t>, Condiciones Generales y Endosos que forman parte de esta póliza.</w:t>
+            </w:r>
           </w:p>
         </w:tc>
       </w:tr>
@@ -4152,7 +2736,7 @@
         <mc:AlternateContent>
           <mc:Choice Requires="wps">
             <w:drawing>
-              <wp:anchor distT="0" distB="0" distL="0" distR="0" simplePos="0" relativeHeight="251659776" behindDoc="1" locked="0" layoutInCell="1" allowOverlap="1">
+              <wp:anchor distT="0" distB="0" distL="0" distR="0" simplePos="0" relativeHeight="251659776" behindDoc="1" locked="0" layoutInCell="1" allowOverlap="1" wp14:anchorId="0493D31C" wp14:editId="361688FA">
                 <wp:simplePos x="0" y="0"/>
                 <wp:positionH relativeFrom="page">
                   <wp:posOffset>288925</wp:posOffset>
@@ -4216,7 +2800,7 @@
           </mc:Choice>
           <mc:Fallback>
             <w:pict>
-              <v:shape w14:anchorId="4FAA9277" id="Graphic 42" o:spid="_x0000_s1026" style="position:absolute;margin-left:22.75pt;margin-top:23.3pt;width:240pt;height:.1pt;z-index:-251656704;visibility:visible;mso-wrap-style:square;mso-wrap-distance-left:0;mso-wrap-distance-top:0;mso-wrap-distance-right:0;mso-wrap-distance-bottom:0;mso-position-horizontal:absolute;mso-position-horizontal-relative:page;mso-position-vertical:absolute;mso-position-vertical-relative:text;v-text-anchor:top" coordsize="3048000,1270" o:gfxdata="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" path="m,l3048000,e" filled="f" strokeweight="1pt">
+              <v:shape w14:anchorId="796AB7FE" id="Graphic 42" o:spid="_x0000_s1026" style="position:absolute;margin-left:22.75pt;margin-top:23.3pt;width:240pt;height:.1pt;z-index:-251656704;visibility:visible;mso-wrap-style:square;mso-wrap-distance-left:0;mso-wrap-distance-top:0;mso-wrap-distance-right:0;mso-wrap-distance-bottom:0;mso-position-horizontal:absolute;mso-position-horizontal-relative:page;mso-position-vertical:absolute;mso-position-vertical-relative:text;v-text-anchor:top" coordsize="3048000,1270" o:gfxdata="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" path="m,l3048000,e" filled="f" strokeweight="1pt">
                 <v:path arrowok="t"/>
                 <w10:wrap type="topAndBottom" anchorx="page"/>
               </v:shape>
@@ -4232,7 +2816,7 @@
         <mc:AlternateContent>
           <mc:Choice Requires="wps">
             <w:drawing>
-              <wp:anchor distT="0" distB="0" distL="0" distR="0" simplePos="0" relativeHeight="251660800" behindDoc="1" locked="0" layoutInCell="1" allowOverlap="1">
+              <wp:anchor distT="0" distB="0" distL="0" distR="0" simplePos="0" relativeHeight="251660800" behindDoc="1" locked="0" layoutInCell="1" allowOverlap="1" wp14:anchorId="1991B451" wp14:editId="05BF4492">
                 <wp:simplePos x="0" y="0"/>
                 <wp:positionH relativeFrom="page">
                   <wp:posOffset>4276725</wp:posOffset>
@@ -4296,7 +2880,7 @@
           </mc:Choice>
           <mc:Fallback>
             <w:pict>
-              <v:shape w14:anchorId="1E0459A2" id="Graphic 43" o:spid="_x0000_s1026" style="position:absolute;margin-left:336.75pt;margin-top:22.55pt;width:240pt;height:.1pt;z-index:-251655680;visibility:visible;mso-wrap-style:square;mso-wrap-distance-left:0;mso-wrap-distance-top:0;mso-wrap-distance-right:0;mso-wrap-distance-bottom:0;mso-position-horizontal:absolute;mso-position-horizontal-relative:page;mso-position-vertical:absolute;mso-position-vertical-relative:text;v-text-anchor:top" coordsize="3048000,1270" o:gfxdata="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" path="m,l3048000,e" filled="f" strokeweight="1pt">
+              <v:shape w14:anchorId="5F07BD47" id="Graphic 43" o:spid="_x0000_s1026" style="position:absolute;margin-left:336.75pt;margin-top:22.55pt;width:240pt;height:.1pt;z-index:-251655680;visibility:visible;mso-wrap-style:square;mso-wrap-distance-left:0;mso-wrap-distance-top:0;mso-wrap-distance-right:0;mso-wrap-distance-bottom:0;mso-position-horizontal:absolute;mso-position-horizontal-relative:page;mso-position-vertical:absolute;mso-position-vertical-relative:text;v-text-anchor:top" coordsize="3048000,1270" o:gfxdata="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" path="m,l3048000,e" filled="f" strokeweight="1pt">
                 <v:path arrowok="t"/>
                 <w10:wrap type="topAndBottom" anchorx="page"/>
               </v:shape>
@@ -4671,99 +3255,6 @@
           <w:sz w:val="11"/>
         </w:rPr>
       </w:pPr>
-    </w:p>
-    <w:p>
-      <w:pPr>
-        <w:ind w:right="800"/>
-        <w:jc w:val="right"/>
-        <w:rPr>
-          <w:rFonts w:ascii="Verdana"/>
-          <w:b/>
-          <w:sz w:val="11"/>
-        </w:rPr>
-      </w:pPr>
-      <w:r>
-        <w:rPr>
-          <w:rFonts w:ascii="Verdana"/>
-          <w:b/>
-          <w:w w:val="105"/>
-          <w:sz w:val="11"/>
-        </w:rPr>
-        <w:t>Torre</w:t>
-      </w:r>
-      <w:r>
-        <w:rPr>
-          <w:rFonts w:ascii="Times New Roman"/>
-          <w:spacing w:val="9"/>
-          <w:w w:val="105"/>
-          <w:sz w:val="11"/>
-        </w:rPr>
-        <w:t xml:space="preserve"> </w:t>
-      </w:r>
-      <w:r>
-        <w:rPr>
-          <w:rFonts w:ascii="Verdana"/>
-          <w:b/>
-          <w:w w:val="105"/>
-          <w:sz w:val="11"/>
-        </w:rPr>
-        <w:t>Global</w:t>
-      </w:r>
-      <w:r>
-        <w:rPr>
-          <w:rFonts w:ascii="Times New Roman"/>
-          <w:spacing w:val="10"/>
-          <w:w w:val="105"/>
-          <w:sz w:val="11"/>
-        </w:rPr>
-        <w:t xml:space="preserve"> </w:t>
-      </w:r>
-      <w:r>
-        <w:rPr>
-          <w:rFonts w:ascii="Verdana"/>
-          <w:b/>
-          <w:w w:val="105"/>
-          <w:sz w:val="11"/>
-        </w:rPr>
-        <w:t>Bank,</w:t>
-      </w:r>
-      <w:r>
-        <w:rPr>
-          <w:rFonts w:ascii="Times New Roman"/>
-          <w:spacing w:val="9"/>
-          <w:w w:val="105"/>
-          <w:sz w:val="11"/>
-        </w:rPr>
-        <w:t xml:space="preserve"> </w:t>
-      </w:r>
-      <w:r>
-        <w:rPr>
-          <w:rFonts w:ascii="Verdana"/>
-          <w:b/>
-          <w:w w:val="105"/>
-          <w:sz w:val="11"/>
-        </w:rPr>
-        <w:t>Calle</w:t>
-      </w:r>
-      <w:r>
-        <w:rPr>
-          <w:rFonts w:ascii="Times New Roman"/>
-          <w:spacing w:val="10"/>
-          <w:w w:val="105"/>
-          <w:sz w:val="11"/>
-        </w:rPr>
-        <w:t xml:space="preserve"> </w:t>
-      </w:r>
-      <w:r>
-        <w:rPr>
-          <w:rFonts w:ascii="Verdana"/>
-          <w:b/>
-          <w:spacing w:val="-5"/>
-          <w:w w:val="105"/>
-          <w:sz w:val="11"/>
-        </w:rPr>
-        <w:t>50</w:t>
-      </w:r>
     </w:p>
     <w:sectPr>
       <w:headerReference w:type="default" r:id="rId6"/>
@@ -4800,1311 +3291,47 @@
 <w:ftr xmlns:wpc="http://schemas.microsoft.com/office/word/2010/wordprocessingCanvas" xmlns:cx="http://schemas.microsoft.com/office/drawing/2014/chartex" xmlns:cx1="http://schemas.microsoft.com/office/drawing/2015/9/8/chartex" xmlns:cx2="http://schemas.microsoft.com/office/drawing/2015/10/21/chartex" xmlns:cx3="http://schemas.microsoft.com/office/drawing/2016/5/9/chartex" xmlns:cx4="http://schemas.microsoft.com/office/drawing/2016/5/10/chartex" xmlns:cx5="http://schemas.microsoft.com/office/drawing/2016/5/11/chartex" xmlns:cx6="http://schemas.microsoft.com/office/drawing/2016/5/12/chartex" xmlns:cx7="http://schemas.microsoft.com/office/drawing/2016/5/13/chartex" xmlns:cx8="http://schemas.microsoft.com/office/drawing/2016/5/14/chartex" xmlns:mc="http://schemas.openxmlformats.org/markup-compatibility/2006" xmlns:aink="http://schemas.microsoft.com/office/drawing/2016/ink" xmlns:am3d="http://schemas.microsoft.com/office/drawing/2017/model3d" xmlns:o="urn:schemas-microsoft-com:office:office" xmlns:oel="http://schemas.microsoft.com/office/2019/extlst" xmlns:r="http://schemas.openxmlformats.org/officeDocument/2006/relationships" xmlns:m="http://schemas.openxmlformats.org/officeDocument/2006/math" xmlns:v="urn:schemas-microsoft-com:vml" xmlns:wp14="http://schemas.microsoft.com/office/word/2010/wordprocessingDrawing" xmlns:wp="http://schemas.openxmlformats.org/drawingml/2006/wordprocessingDrawing" xmlns:w10="urn:schemas-microsoft-com:office:word" xmlns:w="http://schemas.openxmlformats.org/wordprocessingml/2006/main" xmlns:w14="http://schemas.microsoft.com/office/word/2010/wordml" xmlns:w15="http://schemas.microsoft.com/office/word/2012/wordml" xmlns:w16cex="http://schemas.microsoft.com/office/word/2018/wordml/cex" xmlns:w16cid="http://schemas.microsoft.com/office/word/2016/wordml/cid" xmlns:w16="http://schemas.microsoft.com/office/word/2018/wordml" xmlns:w16sdtdh="http://schemas.microsoft.com/office/word/2020/wordml/sdtdatahash" xmlns:w16se="http://schemas.microsoft.com/office/word/2015/wordml/symex" xmlns:wpg="http://schemas.microsoft.com/office/word/2010/wordprocessingGroup" xmlns:wpi="http://schemas.microsoft.com/office/word/2010/wordprocessingInk" xmlns:wne="http://schemas.microsoft.com/office/word/2006/wordml" xmlns:wps="http://schemas.microsoft.com/office/word/2010/wordprocessingShape" mc:Ignorable="w14 w15 w16se w16cid w16 w16cex w16sdtdh wp14">
   <w:p>
     <w:pPr>
-      <w:pStyle w:val="Textoindependiente"/>
-      <w:spacing w:line="14" w:lineRule="auto"/>
+      <w:jc w:val="center"/>
+    </w:pPr>
+    <w:r>
+      <w:rPr>
+        <w:b/>
+        <w:bCs/>
+        <w:sz w:val="16"/>
+        <w:szCs w:val="16"/>
+      </w:rPr>
+      <w:t>Regulado y Supervisado por la Superintendencia de Seguros y Reaseguros de Panamá</w:t>
+    </w:r>
+  </w:p>
+  <w:p>
+    <w:pPr>
+      <w:jc w:val="center"/>
       <w:rPr>
         <w:sz w:val="20"/>
       </w:rPr>
     </w:pPr>
     <w:r>
       <w:rPr>
-        <w:noProof/>
-        <w:sz w:val="20"/>
+        <w:sz w:val="14"/>
+        <w:szCs w:val="14"/>
       </w:rPr>
-      <mc:AlternateContent>
-        <mc:Choice Requires="wps">
-          <w:drawing>
-            <wp:anchor distT="0" distB="0" distL="0" distR="0" simplePos="0" relativeHeight="251656192" behindDoc="1" locked="0" layoutInCell="1" allowOverlap="1">
-              <wp:simplePos x="0" y="0"/>
-              <wp:positionH relativeFrom="page">
-                <wp:posOffset>5895975</wp:posOffset>
-              </wp:positionH>
-              <wp:positionV relativeFrom="page">
-                <wp:posOffset>9604721</wp:posOffset>
-              </wp:positionV>
-              <wp:extent cx="859790" cy="380365"/>
-              <wp:effectExtent l="0" t="0" r="0" b="0"/>
-              <wp:wrapNone/>
-              <wp:docPr id="1" name="Textbox 1"/>
-              <wp:cNvGraphicFramePr>
-                <a:graphicFrameLocks xmlns:a="http://schemas.openxmlformats.org/drawingml/2006/main"/>
-              </wp:cNvGraphicFramePr>
-              <a:graphic xmlns:a="http://schemas.openxmlformats.org/drawingml/2006/main">
-                <a:graphicData uri="http://schemas.microsoft.com/office/word/2010/wordprocessingShape">
-                  <wps:wsp>
-                    <wps:cNvSpPr txBox="1">
-                      <a:spLocks/>
-                    </wps:cNvSpPr>
-                    <wps:spPr>
-                      <a:xfrm>
-                        <a:off x="0" y="0"/>
-                        <a:ext cx="859790" cy="380365"/>
-                      </a:xfrm>
-                      <a:prstGeom prst="rect">
-                        <a:avLst/>
-                      </a:prstGeom>
-                    </wps:spPr>
-                    <wps:txbx>
-                      <w:txbxContent>
-                        <w:p>
-                          <w:pPr>
-                            <w:spacing w:before="18"/>
-                            <w:ind w:left="20"/>
-                            <w:rPr>
-                              <w:sz w:val="14"/>
-                            </w:rPr>
-                          </w:pPr>
-                          <w:r>
-                            <w:rPr>
-                              <w:sz w:val="14"/>
-                            </w:rPr>
-                            <w:t>Apdo.</w:t>
-                          </w:r>
-                          <w:r>
-                            <w:rPr>
-                              <w:rFonts w:ascii="Times New Roman"/>
-                              <w:spacing w:val="13"/>
-                              <w:sz w:val="14"/>
-                            </w:rPr>
-                            <w:t xml:space="preserve"> </w:t>
-                          </w:r>
-                          <w:r>
-                            <w:rPr>
-                              <w:sz w:val="14"/>
-                            </w:rPr>
-                            <w:t>0831-</w:t>
-                          </w:r>
-                          <w:r>
-                            <w:rPr>
-                              <w:spacing w:val="-2"/>
-                              <w:sz w:val="14"/>
-                            </w:rPr>
-                            <w:t>01843</w:t>
-                          </w:r>
-                        </w:p>
-                        <w:p>
-                          <w:pPr>
-                            <w:spacing w:before="85"/>
-                            <w:ind w:left="20"/>
-                            <w:rPr>
-                              <w:rFonts w:ascii="Verdana"/>
-                              <w:sz w:val="11"/>
-                            </w:rPr>
-                          </w:pPr>
-                          <w:r>
-                            <w:rPr>
-                              <w:rFonts w:ascii="Verdana"/>
-                              <w:w w:val="105"/>
-                              <w:sz w:val="11"/>
-                            </w:rPr>
-                            <w:t>Tel.:</w:t>
-                          </w:r>
-                          <w:r>
-                            <w:rPr>
-                              <w:rFonts w:ascii="Times New Roman"/>
-                              <w:spacing w:val="5"/>
-                              <w:w w:val="105"/>
-                              <w:sz w:val="11"/>
-                            </w:rPr>
-                            <w:t xml:space="preserve"> </w:t>
-                          </w:r>
-                          <w:proofErr w:type="gramStart"/>
-                          <w:r>
-                            <w:rPr>
-                              <w:rFonts w:ascii="Verdana"/>
-                              <w:w w:val="105"/>
-                              <w:sz w:val="11"/>
-                            </w:rPr>
-                            <w:t>(</w:t>
-                          </w:r>
-                          <w:r>
-                            <w:rPr>
-                              <w:rFonts w:ascii="Times New Roman"/>
-                              <w:spacing w:val="6"/>
-                              <w:w w:val="105"/>
-                              <w:sz w:val="11"/>
-                            </w:rPr>
-                            <w:t xml:space="preserve"> </w:t>
-                          </w:r>
-                          <w:r>
-                            <w:rPr>
-                              <w:rFonts w:ascii="Verdana"/>
-                              <w:w w:val="105"/>
-                              <w:sz w:val="11"/>
-                            </w:rPr>
-                            <w:t>507</w:t>
-                          </w:r>
-                          <w:proofErr w:type="gramEnd"/>
-                          <w:r>
-                            <w:rPr>
-                              <w:rFonts w:ascii="Verdana"/>
-                              <w:w w:val="105"/>
-                              <w:sz w:val="11"/>
-                            </w:rPr>
-                            <w:t>)</w:t>
-                          </w:r>
-                          <w:r>
-                            <w:rPr>
-                              <w:rFonts w:ascii="Times New Roman"/>
-                              <w:spacing w:val="5"/>
-                              <w:w w:val="105"/>
-                              <w:sz w:val="11"/>
-                            </w:rPr>
-                            <w:t xml:space="preserve"> </w:t>
-                          </w:r>
-                          <w:r>
-                            <w:rPr>
-                              <w:rFonts w:ascii="Verdana"/>
-                              <w:w w:val="105"/>
-                              <w:sz w:val="11"/>
-                            </w:rPr>
-                            <w:t>206-</w:t>
-                          </w:r>
-                          <w:r>
-                            <w:rPr>
-                              <w:rFonts w:ascii="Verdana"/>
-                              <w:spacing w:val="-4"/>
-                              <w:w w:val="105"/>
-                              <w:sz w:val="11"/>
-                            </w:rPr>
-                            <w:t>2021</w:t>
-                          </w:r>
-                        </w:p>
-                        <w:p>
-                          <w:pPr>
-                            <w:spacing w:before="46"/>
-                            <w:ind w:left="20"/>
-                            <w:rPr>
-                              <w:rFonts w:ascii="Verdana"/>
-                              <w:sz w:val="11"/>
-                            </w:rPr>
-                          </w:pPr>
-                          <w:r>
-                            <w:rPr>
-                              <w:rFonts w:ascii="Verdana"/>
-                              <w:w w:val="105"/>
-                              <w:sz w:val="11"/>
-                            </w:rPr>
-                            <w:t>Fax.:</w:t>
-                          </w:r>
-                          <w:r>
-                            <w:rPr>
-                              <w:rFonts w:ascii="Times New Roman"/>
-                              <w:spacing w:val="8"/>
-                              <w:w w:val="105"/>
-                              <w:sz w:val="11"/>
-                            </w:rPr>
-                            <w:t xml:space="preserve"> </w:t>
-                          </w:r>
-                          <w:proofErr w:type="gramStart"/>
-                          <w:r>
-                            <w:rPr>
-                              <w:rFonts w:ascii="Verdana"/>
-                              <w:w w:val="105"/>
-                              <w:sz w:val="11"/>
-                            </w:rPr>
-                            <w:t>(</w:t>
-                          </w:r>
-                          <w:r>
-                            <w:rPr>
-                              <w:rFonts w:ascii="Times New Roman"/>
-                              <w:spacing w:val="9"/>
-                              <w:w w:val="105"/>
-                              <w:sz w:val="11"/>
-                            </w:rPr>
-                            <w:t xml:space="preserve"> </w:t>
-                          </w:r>
-                          <w:r>
-                            <w:rPr>
-                              <w:rFonts w:ascii="Verdana"/>
-                              <w:w w:val="105"/>
-                              <w:sz w:val="11"/>
-                            </w:rPr>
-                            <w:t>507</w:t>
-                          </w:r>
-                          <w:proofErr w:type="gramEnd"/>
-                          <w:r>
-                            <w:rPr>
-                              <w:rFonts w:ascii="Verdana"/>
-                              <w:w w:val="105"/>
-                              <w:sz w:val="11"/>
-                            </w:rPr>
-                            <w:t>)</w:t>
-                          </w:r>
-                          <w:r>
-                            <w:rPr>
-                              <w:rFonts w:ascii="Times New Roman"/>
-                              <w:spacing w:val="8"/>
-                              <w:w w:val="105"/>
-                              <w:sz w:val="11"/>
-                            </w:rPr>
-                            <w:t xml:space="preserve"> </w:t>
-                          </w:r>
-                          <w:r>
-                            <w:rPr>
-                              <w:rFonts w:ascii="Verdana"/>
-                              <w:w w:val="105"/>
-                              <w:sz w:val="11"/>
-                            </w:rPr>
-                            <w:t>206-</w:t>
-                          </w:r>
-                          <w:r>
-                            <w:rPr>
-                              <w:rFonts w:ascii="Verdana"/>
-                              <w:spacing w:val="-4"/>
-                              <w:w w:val="105"/>
-                              <w:sz w:val="11"/>
-                            </w:rPr>
-                            <w:t>2091</w:t>
-                          </w:r>
-                        </w:p>
-                      </w:txbxContent>
-                    </wps:txbx>
-                    <wps:bodyPr wrap="square" lIns="0" tIns="0" rIns="0" bIns="0" rtlCol="0">
-                      <a:noAutofit/>
-                    </wps:bodyPr>
-                  </wps:wsp>
-                </a:graphicData>
-              </a:graphic>
-            </wp:anchor>
-          </w:drawing>
-        </mc:Choice>
-        <mc:Fallback>
-          <w:pict>
-            <v:shapetype id="_x0000_t202" coordsize="21600,21600" o:spt="202" path="m,l,21600r21600,l21600,xe">
-              <v:stroke joinstyle="miter"/>
-              <v:path gradientshapeok="t" o:connecttype="rect"/>
-            </v:shapetype>
-            <v:shape id="Textbox 1" o:spid="_x0000_s1026" type="#_x0000_t202" style="position:absolute;margin-left:464.25pt;margin-top:756.3pt;width:67.7pt;height:29.95pt;z-index:-251660288;visibility:visible;mso-wrap-style:square;mso-wrap-distance-left:0;mso-wrap-distance-top:0;mso-wrap-distance-right:0;mso-wrap-distance-bottom:0;mso-position-horizontal:absolute;mso-position-horizontal-relative:page;mso-position-vertical:absolute;mso-position-vertical-relative:page;v-text-anchor:top" o:gfxdata="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" filled="f" stroked="f">
-              <v:textbox inset="0,0,0,0">
-                <w:txbxContent>
-                  <w:p>
-                    <w:pPr>
-                      <w:spacing w:before="18"/>
-                      <w:ind w:left="20"/>
-                      <w:rPr>
-                        <w:sz w:val="14"/>
-                      </w:rPr>
-                    </w:pPr>
-                    <w:r>
-                      <w:rPr>
-                        <w:sz w:val="14"/>
-                      </w:rPr>
-                      <w:t>Apdo.</w:t>
-                    </w:r>
-                    <w:r>
-                      <w:rPr>
-                        <w:rFonts w:ascii="Times New Roman"/>
-                        <w:spacing w:val="13"/>
-                        <w:sz w:val="14"/>
-                      </w:rPr>
-                      <w:t xml:space="preserve"> </w:t>
-                    </w:r>
-                    <w:r>
-                      <w:rPr>
-                        <w:sz w:val="14"/>
-                      </w:rPr>
-                      <w:t>0831-</w:t>
-                    </w:r>
-                    <w:r>
-                      <w:rPr>
-                        <w:spacing w:val="-2"/>
-                        <w:sz w:val="14"/>
-                      </w:rPr>
-                      <w:t>01843</w:t>
-                    </w:r>
-                  </w:p>
-                  <w:p>
-                    <w:pPr>
-                      <w:spacing w:before="85"/>
-                      <w:ind w:left="20"/>
-                      <w:rPr>
-                        <w:rFonts w:ascii="Verdana"/>
-                        <w:sz w:val="11"/>
-                      </w:rPr>
-                    </w:pPr>
-                    <w:r>
-                      <w:rPr>
-                        <w:rFonts w:ascii="Verdana"/>
-                        <w:w w:val="105"/>
-                        <w:sz w:val="11"/>
-                      </w:rPr>
-                      <w:t>Tel.:</w:t>
-                    </w:r>
-                    <w:r>
-                      <w:rPr>
-                        <w:rFonts w:ascii="Times New Roman"/>
-                        <w:spacing w:val="5"/>
-                        <w:w w:val="105"/>
-                        <w:sz w:val="11"/>
-                      </w:rPr>
-                      <w:t xml:space="preserve"> </w:t>
-                    </w:r>
-                    <w:proofErr w:type="gramStart"/>
-                    <w:r>
-                      <w:rPr>
-                        <w:rFonts w:ascii="Verdana"/>
-                        <w:w w:val="105"/>
-                        <w:sz w:val="11"/>
-                      </w:rPr>
-                      <w:t>(</w:t>
-                    </w:r>
-                    <w:r>
-                      <w:rPr>
-                        <w:rFonts w:ascii="Times New Roman"/>
-                        <w:spacing w:val="6"/>
-                        <w:w w:val="105"/>
-                        <w:sz w:val="11"/>
-                      </w:rPr>
-                      <w:t xml:space="preserve"> </w:t>
-                    </w:r>
-                    <w:r>
-                      <w:rPr>
-                        <w:rFonts w:ascii="Verdana"/>
-                        <w:w w:val="105"/>
-                        <w:sz w:val="11"/>
-                      </w:rPr>
-                      <w:t>507</w:t>
-                    </w:r>
-                    <w:proofErr w:type="gramEnd"/>
-                    <w:r>
-                      <w:rPr>
-                        <w:rFonts w:ascii="Verdana"/>
-                        <w:w w:val="105"/>
-                        <w:sz w:val="11"/>
-                      </w:rPr>
-                      <w:t>)</w:t>
-                    </w:r>
-                    <w:r>
-                      <w:rPr>
-                        <w:rFonts w:ascii="Times New Roman"/>
-                        <w:spacing w:val="5"/>
-                        <w:w w:val="105"/>
-                        <w:sz w:val="11"/>
-                      </w:rPr>
-                      <w:t xml:space="preserve"> </w:t>
-                    </w:r>
-                    <w:r>
-                      <w:rPr>
-                        <w:rFonts w:ascii="Verdana"/>
-                        <w:w w:val="105"/>
-                        <w:sz w:val="11"/>
-                      </w:rPr>
-                      <w:t>206-</w:t>
-                    </w:r>
-                    <w:r>
-                      <w:rPr>
-                        <w:rFonts w:ascii="Verdana"/>
-                        <w:spacing w:val="-4"/>
-                        <w:w w:val="105"/>
-                        <w:sz w:val="11"/>
-                      </w:rPr>
-                      <w:t>2021</w:t>
-                    </w:r>
-                  </w:p>
-                  <w:p>
-                    <w:pPr>
-                      <w:spacing w:before="46"/>
-                      <w:ind w:left="20"/>
-                      <w:rPr>
-                        <w:rFonts w:ascii="Verdana"/>
-                        <w:sz w:val="11"/>
-                      </w:rPr>
-                    </w:pPr>
-                    <w:r>
-                      <w:rPr>
-                        <w:rFonts w:ascii="Verdana"/>
-                        <w:w w:val="105"/>
-                        <w:sz w:val="11"/>
-                      </w:rPr>
-                      <w:t>Fax.:</w:t>
-                    </w:r>
-                    <w:r>
-                      <w:rPr>
-                        <w:rFonts w:ascii="Times New Roman"/>
-                        <w:spacing w:val="8"/>
-                        <w:w w:val="105"/>
-                        <w:sz w:val="11"/>
-                      </w:rPr>
-                      <w:t xml:space="preserve"> </w:t>
-                    </w:r>
-                    <w:proofErr w:type="gramStart"/>
-                    <w:r>
-                      <w:rPr>
-                        <w:rFonts w:ascii="Verdana"/>
-                        <w:w w:val="105"/>
-                        <w:sz w:val="11"/>
-                      </w:rPr>
-                      <w:t>(</w:t>
-                    </w:r>
-                    <w:r>
-                      <w:rPr>
-                        <w:rFonts w:ascii="Times New Roman"/>
-                        <w:spacing w:val="9"/>
-                        <w:w w:val="105"/>
-                        <w:sz w:val="11"/>
-                      </w:rPr>
-                      <w:t xml:space="preserve"> </w:t>
-                    </w:r>
-                    <w:r>
-                      <w:rPr>
-                        <w:rFonts w:ascii="Verdana"/>
-                        <w:w w:val="105"/>
-                        <w:sz w:val="11"/>
-                      </w:rPr>
-                      <w:t>507</w:t>
-                    </w:r>
-                    <w:proofErr w:type="gramEnd"/>
-                    <w:r>
-                      <w:rPr>
-                        <w:rFonts w:ascii="Verdana"/>
-                        <w:w w:val="105"/>
-                        <w:sz w:val="11"/>
-                      </w:rPr>
-                      <w:t>)</w:t>
-                    </w:r>
-                    <w:r>
-                      <w:rPr>
-                        <w:rFonts w:ascii="Times New Roman"/>
-                        <w:spacing w:val="8"/>
-                        <w:w w:val="105"/>
-                        <w:sz w:val="11"/>
-                      </w:rPr>
-                      <w:t xml:space="preserve"> </w:t>
-                    </w:r>
-                    <w:r>
-                      <w:rPr>
-                        <w:rFonts w:ascii="Verdana"/>
-                        <w:w w:val="105"/>
-                        <w:sz w:val="11"/>
-                      </w:rPr>
-                      <w:t>206-</w:t>
-                    </w:r>
-                    <w:r>
-                      <w:rPr>
-                        <w:rFonts w:ascii="Verdana"/>
-                        <w:spacing w:val="-4"/>
-                        <w:w w:val="105"/>
-                        <w:sz w:val="11"/>
-                      </w:rPr>
-                      <w:t>2091</w:t>
-                    </w:r>
-                  </w:p>
-                </w:txbxContent>
-              </v:textbox>
-              <w10:wrap anchorx="page" anchory="page"/>
-            </v:shape>
-          </w:pict>
-        </mc:Fallback>
-      </mc:AlternateContent>
+      <w:t xml:space="preserve">Calle 50 Torre Global Bank. </w:t>
     </w:r>
+    <w:proofErr w:type="spellStart"/>
     <w:r>
       <w:rPr>
-        <w:noProof/>
-        <w:sz w:val="20"/>
+        <w:sz w:val="14"/>
+        <w:szCs w:val="14"/>
       </w:rPr>
-      <mc:AlternateContent>
-        <mc:Choice Requires="wps">
-          <w:drawing>
-            <wp:anchor distT="0" distB="0" distL="0" distR="0" simplePos="0" relativeHeight="251658240" behindDoc="1" locked="0" layoutInCell="1" allowOverlap="1">
-              <wp:simplePos x="0" y="0"/>
-              <wp:positionH relativeFrom="page">
-                <wp:posOffset>142875</wp:posOffset>
-              </wp:positionH>
-              <wp:positionV relativeFrom="page">
-                <wp:posOffset>9659518</wp:posOffset>
-              </wp:positionV>
-              <wp:extent cx="3048000" cy="114300"/>
-              <wp:effectExtent l="0" t="0" r="0" b="0"/>
-              <wp:wrapNone/>
-              <wp:docPr id="2" name="Textbox 2"/>
-              <wp:cNvGraphicFramePr>
-                <a:graphicFrameLocks xmlns:a="http://schemas.openxmlformats.org/drawingml/2006/main"/>
-              </wp:cNvGraphicFramePr>
-              <a:graphic xmlns:a="http://schemas.openxmlformats.org/drawingml/2006/main">
-                <a:graphicData uri="http://schemas.microsoft.com/office/word/2010/wordprocessingShape">
-                  <wps:wsp>
-                    <wps:cNvSpPr txBox="1">
-                      <a:spLocks/>
-                    </wps:cNvSpPr>
-                    <wps:spPr>
-                      <a:xfrm>
-                        <a:off x="0" y="0"/>
-                        <a:ext cx="3048000" cy="114300"/>
-                      </a:xfrm>
-                      <a:prstGeom prst="rect">
-                        <a:avLst/>
-                      </a:prstGeom>
-                    </wps:spPr>
-                    <wps:txbx>
-                      <w:txbxContent>
-                        <w:p>
-                          <w:pPr>
-                            <w:pStyle w:val="Textoindependiente"/>
-                            <w:spacing w:before="20"/>
-                            <w:ind w:left="20"/>
-                          </w:pPr>
-                          <w:r>
-                            <w:rPr>
-                              <w:w w:val="105"/>
-                            </w:rPr>
-                            <w:t>Los</w:t>
-                          </w:r>
-                          <w:r>
-                            <w:rPr>
-                              <w:rFonts w:ascii="Times New Roman" w:hAnsi="Times New Roman"/>
-                              <w:spacing w:val="-8"/>
-                              <w:w w:val="105"/>
-                            </w:rPr>
-                            <w:t xml:space="preserve"> </w:t>
-                          </w:r>
-                          <w:r>
-                            <w:rPr>
-                              <w:w w:val="105"/>
-                            </w:rPr>
-                            <w:t>Timbres</w:t>
-                          </w:r>
-                          <w:r>
-                            <w:rPr>
-                              <w:rFonts w:ascii="Times New Roman" w:hAnsi="Times New Roman"/>
-                              <w:spacing w:val="-6"/>
-                              <w:w w:val="105"/>
-                            </w:rPr>
-                            <w:t xml:space="preserve"> </w:t>
-                          </w:r>
-                          <w:r>
-                            <w:rPr>
-                              <w:w w:val="105"/>
-                            </w:rPr>
-                            <w:t>que</w:t>
-                          </w:r>
-                          <w:r>
-                            <w:rPr>
-                              <w:rFonts w:ascii="Times New Roman" w:hAnsi="Times New Roman"/>
-                              <w:spacing w:val="-5"/>
-                              <w:w w:val="105"/>
-                            </w:rPr>
-                            <w:t xml:space="preserve"> </w:t>
-                          </w:r>
-                          <w:r>
-                            <w:rPr>
-                              <w:w w:val="105"/>
-                            </w:rPr>
-                            <w:t>corresponden</w:t>
-                          </w:r>
-                          <w:r>
-                            <w:rPr>
-                              <w:rFonts w:ascii="Times New Roman" w:hAnsi="Times New Roman"/>
-                              <w:spacing w:val="-4"/>
-                              <w:w w:val="105"/>
-                            </w:rPr>
-                            <w:t xml:space="preserve"> </w:t>
-                          </w:r>
-                          <w:r>
-                            <w:rPr>
-                              <w:w w:val="105"/>
-                            </w:rPr>
-                            <w:t>al</w:t>
-                          </w:r>
-                          <w:r>
-                            <w:rPr>
-                              <w:rFonts w:ascii="Times New Roman" w:hAnsi="Times New Roman"/>
-                              <w:spacing w:val="-4"/>
-                              <w:w w:val="105"/>
-                            </w:rPr>
-                            <w:t xml:space="preserve"> </w:t>
-                          </w:r>
-                          <w:r>
-                            <w:rPr>
-                              <w:w w:val="105"/>
-                            </w:rPr>
-                            <w:t>presente</w:t>
-                          </w:r>
-                          <w:r>
-                            <w:rPr>
-                              <w:rFonts w:ascii="Times New Roman" w:hAnsi="Times New Roman"/>
-                              <w:spacing w:val="-4"/>
-                              <w:w w:val="105"/>
-                            </w:rPr>
-                            <w:t xml:space="preserve"> </w:t>
-                          </w:r>
-                          <w:proofErr w:type="gramStart"/>
-                          <w:r>
-                            <w:rPr>
-                              <w:w w:val="105"/>
-                            </w:rPr>
-                            <w:t>documento</w:t>
-                          </w:r>
-                          <w:r>
-                            <w:rPr>
-                              <w:rFonts w:ascii="Times New Roman" w:hAnsi="Times New Roman"/>
-                              <w:spacing w:val="-13"/>
-                              <w:w w:val="105"/>
-                            </w:rPr>
-                            <w:t xml:space="preserve"> </w:t>
-                          </w:r>
-                          <w:r>
-                            <w:rPr>
-                              <w:w w:val="105"/>
-                            </w:rPr>
-                            <w:t>,</w:t>
-                          </w:r>
-                          <w:proofErr w:type="gramEnd"/>
-                          <w:r>
-                            <w:rPr>
-                              <w:rFonts w:ascii="Times New Roman" w:hAnsi="Times New Roman"/>
-                              <w:spacing w:val="-4"/>
-                              <w:w w:val="105"/>
-                            </w:rPr>
-                            <w:t xml:space="preserve"> </w:t>
-                          </w:r>
-                          <w:r>
-                            <w:rPr>
-                              <w:w w:val="105"/>
-                            </w:rPr>
-                            <w:t>son</w:t>
-                          </w:r>
-                          <w:r>
-                            <w:rPr>
-                              <w:rFonts w:ascii="Times New Roman" w:hAnsi="Times New Roman"/>
-                              <w:spacing w:val="-4"/>
-                              <w:w w:val="105"/>
-                            </w:rPr>
-                            <w:t xml:space="preserve"> </w:t>
-                          </w:r>
-                          <w:r>
-                            <w:rPr>
-                              <w:w w:val="105"/>
-                            </w:rPr>
-                            <w:t>pagados</w:t>
-                          </w:r>
-                          <w:r>
-                            <w:rPr>
-                              <w:rFonts w:ascii="Times New Roman" w:hAnsi="Times New Roman"/>
-                              <w:spacing w:val="-5"/>
-                              <w:w w:val="105"/>
-                            </w:rPr>
-                            <w:t xml:space="preserve"> </w:t>
-                          </w:r>
-                          <w:r>
-                            <w:rPr>
-                              <w:w w:val="105"/>
-                            </w:rPr>
-                            <w:t>por</w:t>
-                          </w:r>
-                          <w:r>
-                            <w:rPr>
-                              <w:rFonts w:ascii="Times New Roman" w:hAnsi="Times New Roman"/>
-                              <w:spacing w:val="-4"/>
-                              <w:w w:val="105"/>
-                            </w:rPr>
-                            <w:t xml:space="preserve"> </w:t>
-                          </w:r>
-                          <w:r>
-                            <w:rPr>
-                              <w:spacing w:val="-2"/>
-                              <w:w w:val="105"/>
-                            </w:rPr>
-                            <w:t>declaración.</w:t>
-                          </w:r>
-                        </w:p>
-                      </w:txbxContent>
-                    </wps:txbx>
-                    <wps:bodyPr wrap="square" lIns="0" tIns="0" rIns="0" bIns="0" rtlCol="0">
-                      <a:noAutofit/>
-                    </wps:bodyPr>
-                  </wps:wsp>
-                </a:graphicData>
-              </a:graphic>
-            </wp:anchor>
-          </w:drawing>
-        </mc:Choice>
-        <mc:Fallback>
-          <w:pict>
-            <v:shape id="Textbox 2" o:spid="_x0000_s1027" type="#_x0000_t202" style="position:absolute;margin-left:11.25pt;margin-top:760.6pt;width:240pt;height:9pt;z-index:-251658240;visibility:visible;mso-wrap-style:square;mso-wrap-distance-left:0;mso-wrap-distance-top:0;mso-wrap-distance-right:0;mso-wrap-distance-bottom:0;mso-position-horizontal:absolute;mso-position-horizontal-relative:page;mso-position-vertical:absolute;mso-position-vertical-relative:page;v-text-anchor:top" o:gfxdata="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" filled="f" stroked="f">
-              <v:textbox inset="0,0,0,0">
-                <w:txbxContent>
-                  <w:p>
-                    <w:pPr>
-                      <w:pStyle w:val="Textoindependiente"/>
-                      <w:spacing w:before="20"/>
-                      <w:ind w:left="20"/>
-                    </w:pPr>
-                    <w:r>
-                      <w:rPr>
-                        <w:w w:val="105"/>
-                      </w:rPr>
-                      <w:t>Los</w:t>
-                    </w:r>
-                    <w:r>
-                      <w:rPr>
-                        <w:rFonts w:ascii="Times New Roman" w:hAnsi="Times New Roman"/>
-                        <w:spacing w:val="-8"/>
-                        <w:w w:val="105"/>
-                      </w:rPr>
-                      <w:t xml:space="preserve"> </w:t>
-                    </w:r>
-                    <w:r>
-                      <w:rPr>
-                        <w:w w:val="105"/>
-                      </w:rPr>
-                      <w:t>Timbres</w:t>
-                    </w:r>
-                    <w:r>
-                      <w:rPr>
-                        <w:rFonts w:ascii="Times New Roman" w:hAnsi="Times New Roman"/>
-                        <w:spacing w:val="-6"/>
-                        <w:w w:val="105"/>
-                      </w:rPr>
-                      <w:t xml:space="preserve"> </w:t>
-                    </w:r>
-                    <w:r>
-                      <w:rPr>
-                        <w:w w:val="105"/>
-                      </w:rPr>
-                      <w:t>que</w:t>
-                    </w:r>
-                    <w:r>
-                      <w:rPr>
-                        <w:rFonts w:ascii="Times New Roman" w:hAnsi="Times New Roman"/>
-                        <w:spacing w:val="-5"/>
-                        <w:w w:val="105"/>
-                      </w:rPr>
-                      <w:t xml:space="preserve"> </w:t>
-                    </w:r>
-                    <w:r>
-                      <w:rPr>
-                        <w:w w:val="105"/>
-                      </w:rPr>
-                      <w:t>corresponden</w:t>
-                    </w:r>
-                    <w:r>
-                      <w:rPr>
-                        <w:rFonts w:ascii="Times New Roman" w:hAnsi="Times New Roman"/>
-                        <w:spacing w:val="-4"/>
-                        <w:w w:val="105"/>
-                      </w:rPr>
-                      <w:t xml:space="preserve"> </w:t>
-                    </w:r>
-                    <w:r>
-                      <w:rPr>
-                        <w:w w:val="105"/>
-                      </w:rPr>
-                      <w:t>al</w:t>
-                    </w:r>
-                    <w:r>
-                      <w:rPr>
-                        <w:rFonts w:ascii="Times New Roman" w:hAnsi="Times New Roman"/>
-                        <w:spacing w:val="-4"/>
-                        <w:w w:val="105"/>
-                      </w:rPr>
-                      <w:t xml:space="preserve"> </w:t>
-                    </w:r>
-                    <w:r>
-                      <w:rPr>
-                        <w:w w:val="105"/>
-                      </w:rPr>
-                      <w:t>presente</w:t>
-                    </w:r>
-                    <w:r>
-                      <w:rPr>
-                        <w:rFonts w:ascii="Times New Roman" w:hAnsi="Times New Roman"/>
-                        <w:spacing w:val="-4"/>
-                        <w:w w:val="105"/>
-                      </w:rPr>
-                      <w:t xml:space="preserve"> </w:t>
-                    </w:r>
-                    <w:proofErr w:type="gramStart"/>
-                    <w:r>
-                      <w:rPr>
-                        <w:w w:val="105"/>
-                      </w:rPr>
-                      <w:t>documento</w:t>
-                    </w:r>
-                    <w:r>
-                      <w:rPr>
-                        <w:rFonts w:ascii="Times New Roman" w:hAnsi="Times New Roman"/>
-                        <w:spacing w:val="-13"/>
-                        <w:w w:val="105"/>
-                      </w:rPr>
-                      <w:t xml:space="preserve"> </w:t>
-                    </w:r>
-                    <w:r>
-                      <w:rPr>
-                        <w:w w:val="105"/>
-                      </w:rPr>
-                      <w:t>,</w:t>
-                    </w:r>
-                    <w:proofErr w:type="gramEnd"/>
-                    <w:r>
-                      <w:rPr>
-                        <w:rFonts w:ascii="Times New Roman" w:hAnsi="Times New Roman"/>
-                        <w:spacing w:val="-4"/>
-                        <w:w w:val="105"/>
-                      </w:rPr>
-                      <w:t xml:space="preserve"> </w:t>
-                    </w:r>
-                    <w:r>
-                      <w:rPr>
-                        <w:w w:val="105"/>
-                      </w:rPr>
-                      <w:t>son</w:t>
-                    </w:r>
-                    <w:r>
-                      <w:rPr>
-                        <w:rFonts w:ascii="Times New Roman" w:hAnsi="Times New Roman"/>
-                        <w:spacing w:val="-4"/>
-                        <w:w w:val="105"/>
-                      </w:rPr>
-                      <w:t xml:space="preserve"> </w:t>
-                    </w:r>
-                    <w:r>
-                      <w:rPr>
-                        <w:w w:val="105"/>
-                      </w:rPr>
-                      <w:t>pagados</w:t>
-                    </w:r>
-                    <w:r>
-                      <w:rPr>
-                        <w:rFonts w:ascii="Times New Roman" w:hAnsi="Times New Roman"/>
-                        <w:spacing w:val="-5"/>
-                        <w:w w:val="105"/>
-                      </w:rPr>
-                      <w:t xml:space="preserve"> </w:t>
-                    </w:r>
-                    <w:r>
-                      <w:rPr>
-                        <w:w w:val="105"/>
-                      </w:rPr>
-                      <w:t>por</w:t>
-                    </w:r>
-                    <w:r>
-                      <w:rPr>
-                        <w:rFonts w:ascii="Times New Roman" w:hAnsi="Times New Roman"/>
-                        <w:spacing w:val="-4"/>
-                        <w:w w:val="105"/>
-                      </w:rPr>
-                      <w:t xml:space="preserve"> </w:t>
-                    </w:r>
-                    <w:r>
-                      <w:rPr>
-                        <w:spacing w:val="-2"/>
-                        <w:w w:val="105"/>
-                      </w:rPr>
-                      <w:t>declaración.</w:t>
-                    </w:r>
-                  </w:p>
-                </w:txbxContent>
-              </v:textbox>
-              <w10:wrap anchorx="page" anchory="page"/>
-            </v:shape>
-          </w:pict>
-        </mc:Fallback>
-      </mc:AlternateContent>
+      <w:t>Mezzanine</w:t>
     </w:r>
+    <w:proofErr w:type="spellEnd"/>
     <w:r>
       <w:rPr>
-        <w:noProof/>
-        <w:sz w:val="20"/>
+        <w:sz w:val="14"/>
+        <w:szCs w:val="14"/>
       </w:rPr>
-      <mc:AlternateContent>
-        <mc:Choice Requires="wps">
-          <w:drawing>
-            <wp:anchor distT="0" distB="0" distL="0" distR="0" simplePos="0" relativeHeight="251660288" behindDoc="1" locked="0" layoutInCell="1" allowOverlap="1">
-              <wp:simplePos x="0" y="0"/>
-              <wp:positionH relativeFrom="page">
-                <wp:posOffset>130175</wp:posOffset>
-              </wp:positionH>
-              <wp:positionV relativeFrom="page">
-                <wp:posOffset>9899996</wp:posOffset>
-              </wp:positionV>
-              <wp:extent cx="3563620" cy="127000"/>
-              <wp:effectExtent l="0" t="0" r="0" b="0"/>
-              <wp:wrapNone/>
-              <wp:docPr id="3" name="Textbox 3"/>
-              <wp:cNvGraphicFramePr>
-                <a:graphicFrameLocks xmlns:a="http://schemas.openxmlformats.org/drawingml/2006/main"/>
-              </wp:cNvGraphicFramePr>
-              <a:graphic xmlns:a="http://schemas.openxmlformats.org/drawingml/2006/main">
-                <a:graphicData uri="http://schemas.microsoft.com/office/word/2010/wordprocessingShape">
-                  <wps:wsp>
-                    <wps:cNvSpPr txBox="1">
-                      <a:spLocks/>
-                    </wps:cNvSpPr>
-                    <wps:spPr>
-                      <a:xfrm>
-                        <a:off x="0" y="0"/>
-                        <a:ext cx="3563620" cy="127000"/>
-                      </a:xfrm>
-                      <a:prstGeom prst="rect">
-                        <a:avLst/>
-                      </a:prstGeom>
-                    </wps:spPr>
-                    <wps:txbx>
-                      <w:txbxContent>
-                        <w:p>
-                          <w:pPr>
-                            <w:spacing w:before="18"/>
-                            <w:ind w:left="20"/>
-                            <w:rPr>
-                              <w:sz w:val="14"/>
-                            </w:rPr>
-                          </w:pPr>
-                          <w:r>
-                            <w:rPr>
-                              <w:sz w:val="14"/>
-                            </w:rPr>
-                            <w:t>Regulado</w:t>
-                          </w:r>
-                          <w:r>
-                            <w:rPr>
-                              <w:rFonts w:ascii="Times New Roman" w:hAnsi="Times New Roman"/>
-                              <w:spacing w:val="9"/>
-                              <w:sz w:val="14"/>
-                            </w:rPr>
-                            <w:t xml:space="preserve"> </w:t>
-                          </w:r>
-                          <w:r>
-                            <w:rPr>
-                              <w:sz w:val="14"/>
-                            </w:rPr>
-                            <w:t>y</w:t>
-                          </w:r>
-                          <w:r>
-                            <w:rPr>
-                              <w:rFonts w:ascii="Times New Roman" w:hAnsi="Times New Roman"/>
-                              <w:spacing w:val="9"/>
-                              <w:sz w:val="14"/>
-                            </w:rPr>
-                            <w:t xml:space="preserve"> </w:t>
-                          </w:r>
-                          <w:r>
-                            <w:rPr>
-                              <w:sz w:val="14"/>
-                            </w:rPr>
-                            <w:t>Supervisado</w:t>
-                          </w:r>
-                          <w:r>
-                            <w:rPr>
-                              <w:rFonts w:ascii="Times New Roman" w:hAnsi="Times New Roman"/>
-                              <w:spacing w:val="9"/>
-                              <w:sz w:val="14"/>
-                            </w:rPr>
-                            <w:t xml:space="preserve"> </w:t>
-                          </w:r>
-                          <w:r>
-                            <w:rPr>
-                              <w:sz w:val="14"/>
-                            </w:rPr>
-                            <w:t>por</w:t>
-                          </w:r>
-                          <w:r>
-                            <w:rPr>
-                              <w:rFonts w:ascii="Times New Roman" w:hAnsi="Times New Roman"/>
-                              <w:spacing w:val="9"/>
-                              <w:sz w:val="14"/>
-                            </w:rPr>
-                            <w:t xml:space="preserve"> </w:t>
-                          </w:r>
-                          <w:r>
-                            <w:rPr>
-                              <w:sz w:val="14"/>
-                            </w:rPr>
-                            <w:t>la</w:t>
-                          </w:r>
-                          <w:r>
-                            <w:rPr>
-                              <w:rFonts w:ascii="Times New Roman" w:hAnsi="Times New Roman"/>
-                              <w:spacing w:val="9"/>
-                              <w:sz w:val="14"/>
-                            </w:rPr>
-                            <w:t xml:space="preserve"> </w:t>
-                          </w:r>
-                          <w:r>
-                            <w:rPr>
-                              <w:sz w:val="14"/>
-                            </w:rPr>
-                            <w:t>Superintendencia</w:t>
-                          </w:r>
-                          <w:r>
-                            <w:rPr>
-                              <w:rFonts w:ascii="Times New Roman" w:hAnsi="Times New Roman"/>
-                              <w:spacing w:val="9"/>
-                              <w:sz w:val="14"/>
-                            </w:rPr>
-                            <w:t xml:space="preserve"> </w:t>
-                          </w:r>
-                          <w:r>
-                            <w:rPr>
-                              <w:sz w:val="14"/>
-                            </w:rPr>
-                            <w:t>de</w:t>
-                          </w:r>
-                          <w:r>
-                            <w:rPr>
-                              <w:rFonts w:ascii="Times New Roman" w:hAnsi="Times New Roman"/>
-                              <w:spacing w:val="9"/>
-                              <w:sz w:val="14"/>
-                            </w:rPr>
-                            <w:t xml:space="preserve"> </w:t>
-                          </w:r>
-                          <w:r>
-                            <w:rPr>
-                              <w:sz w:val="14"/>
-                            </w:rPr>
-                            <w:t>Seguros</w:t>
-                          </w:r>
-                          <w:r>
-                            <w:rPr>
-                              <w:rFonts w:ascii="Times New Roman" w:hAnsi="Times New Roman"/>
-                              <w:spacing w:val="9"/>
-                              <w:sz w:val="14"/>
-                            </w:rPr>
-                            <w:t xml:space="preserve"> </w:t>
-                          </w:r>
-                          <w:r>
-                            <w:rPr>
-                              <w:sz w:val="14"/>
-                            </w:rPr>
-                            <w:t>y</w:t>
-                          </w:r>
-                          <w:r>
-                            <w:rPr>
-                              <w:rFonts w:ascii="Times New Roman" w:hAnsi="Times New Roman"/>
-                              <w:spacing w:val="9"/>
-                              <w:sz w:val="14"/>
-                            </w:rPr>
-                            <w:t xml:space="preserve"> </w:t>
-                          </w:r>
-                          <w:r>
-                            <w:rPr>
-                              <w:sz w:val="14"/>
-                            </w:rPr>
-                            <w:t>Reaseguros</w:t>
-                          </w:r>
-                          <w:r>
-                            <w:rPr>
-                              <w:rFonts w:ascii="Times New Roman" w:hAnsi="Times New Roman"/>
-                              <w:spacing w:val="9"/>
-                              <w:sz w:val="14"/>
-                            </w:rPr>
-                            <w:t xml:space="preserve"> </w:t>
-                          </w:r>
-                          <w:r>
-                            <w:rPr>
-                              <w:sz w:val="14"/>
-                            </w:rPr>
-                            <w:t>de</w:t>
-                          </w:r>
-                          <w:r>
-                            <w:rPr>
-                              <w:rFonts w:ascii="Times New Roman" w:hAnsi="Times New Roman"/>
-                              <w:spacing w:val="9"/>
-                              <w:sz w:val="14"/>
-                            </w:rPr>
-                            <w:t xml:space="preserve"> </w:t>
-                          </w:r>
-                          <w:r>
-                            <w:rPr>
-                              <w:spacing w:val="-2"/>
-                              <w:sz w:val="14"/>
-                            </w:rPr>
-                            <w:t>Panamá</w:t>
-                          </w:r>
-                        </w:p>
-                      </w:txbxContent>
-                    </wps:txbx>
-                    <wps:bodyPr wrap="square" lIns="0" tIns="0" rIns="0" bIns="0" rtlCol="0">
-                      <a:noAutofit/>
-                    </wps:bodyPr>
-                  </wps:wsp>
-                </a:graphicData>
-              </a:graphic>
-            </wp:anchor>
-          </w:drawing>
-        </mc:Choice>
-        <mc:Fallback>
-          <w:pict>
-            <v:shape id="Textbox 3" o:spid="_x0000_s1028" type="#_x0000_t202" style="position:absolute;margin-left:10.25pt;margin-top:779.55pt;width:280.6pt;height:10pt;z-index:-251656192;visibility:visible;mso-wrap-style:square;mso-wrap-distance-left:0;mso-wrap-distance-top:0;mso-wrap-distance-right:0;mso-wrap-distance-bottom:0;mso-position-horizontal:absolute;mso-position-horizontal-relative:page;mso-position-vertical:absolute;mso-position-vertical-relative:page;v-text-anchor:top" o:gfxdata="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" filled="f" stroked="f">
-              <v:textbox inset="0,0,0,0">
-                <w:txbxContent>
-                  <w:p>
-                    <w:pPr>
-                      <w:spacing w:before="18"/>
-                      <w:ind w:left="20"/>
-                      <w:rPr>
-                        <w:sz w:val="14"/>
-                      </w:rPr>
-                    </w:pPr>
-                    <w:r>
-                      <w:rPr>
-                        <w:sz w:val="14"/>
-                      </w:rPr>
-                      <w:t>Regulado</w:t>
-                    </w:r>
-                    <w:r>
-                      <w:rPr>
-                        <w:rFonts w:ascii="Times New Roman" w:hAnsi="Times New Roman"/>
-                        <w:spacing w:val="9"/>
-                        <w:sz w:val="14"/>
-                      </w:rPr>
-                      <w:t xml:space="preserve"> </w:t>
-                    </w:r>
-                    <w:r>
-                      <w:rPr>
-                        <w:sz w:val="14"/>
-                      </w:rPr>
-                      <w:t>y</w:t>
-                    </w:r>
-                    <w:r>
-                      <w:rPr>
-                        <w:rFonts w:ascii="Times New Roman" w:hAnsi="Times New Roman"/>
-                        <w:spacing w:val="9"/>
-                        <w:sz w:val="14"/>
-                      </w:rPr>
-                      <w:t xml:space="preserve"> </w:t>
-                    </w:r>
-                    <w:r>
-                      <w:rPr>
-                        <w:sz w:val="14"/>
-                      </w:rPr>
-                      <w:t>Supervisado</w:t>
-                    </w:r>
-                    <w:r>
-                      <w:rPr>
-                        <w:rFonts w:ascii="Times New Roman" w:hAnsi="Times New Roman"/>
-                        <w:spacing w:val="9"/>
-                        <w:sz w:val="14"/>
-                      </w:rPr>
-                      <w:t xml:space="preserve"> </w:t>
-                    </w:r>
-                    <w:r>
-                      <w:rPr>
-                        <w:sz w:val="14"/>
-                      </w:rPr>
-                      <w:t>por</w:t>
-                    </w:r>
-                    <w:r>
-                      <w:rPr>
-                        <w:rFonts w:ascii="Times New Roman" w:hAnsi="Times New Roman"/>
-                        <w:spacing w:val="9"/>
-                        <w:sz w:val="14"/>
-                      </w:rPr>
-                      <w:t xml:space="preserve"> </w:t>
-                    </w:r>
-                    <w:r>
-                      <w:rPr>
-                        <w:sz w:val="14"/>
-                      </w:rPr>
-                      <w:t>la</w:t>
-                    </w:r>
-                    <w:r>
-                      <w:rPr>
-                        <w:rFonts w:ascii="Times New Roman" w:hAnsi="Times New Roman"/>
-                        <w:spacing w:val="9"/>
-                        <w:sz w:val="14"/>
-                      </w:rPr>
-                      <w:t xml:space="preserve"> </w:t>
-                    </w:r>
-                    <w:r>
-                      <w:rPr>
-                        <w:sz w:val="14"/>
-                      </w:rPr>
-                      <w:t>Superintendencia</w:t>
-                    </w:r>
-                    <w:r>
-                      <w:rPr>
-                        <w:rFonts w:ascii="Times New Roman" w:hAnsi="Times New Roman"/>
-                        <w:spacing w:val="9"/>
-                        <w:sz w:val="14"/>
-                      </w:rPr>
-                      <w:t xml:space="preserve"> </w:t>
-                    </w:r>
-                    <w:r>
-                      <w:rPr>
-                        <w:sz w:val="14"/>
-                      </w:rPr>
-                      <w:t>de</w:t>
-                    </w:r>
-                    <w:r>
-                      <w:rPr>
-                        <w:rFonts w:ascii="Times New Roman" w:hAnsi="Times New Roman"/>
-                        <w:spacing w:val="9"/>
-                        <w:sz w:val="14"/>
-                      </w:rPr>
-                      <w:t xml:space="preserve"> </w:t>
-                    </w:r>
-                    <w:r>
-                      <w:rPr>
-                        <w:sz w:val="14"/>
-                      </w:rPr>
-                      <w:t>Seguros</w:t>
-                    </w:r>
-                    <w:r>
-                      <w:rPr>
-                        <w:rFonts w:ascii="Times New Roman" w:hAnsi="Times New Roman"/>
-                        <w:spacing w:val="9"/>
-                        <w:sz w:val="14"/>
-                      </w:rPr>
-                      <w:t xml:space="preserve"> </w:t>
-                    </w:r>
-                    <w:r>
-                      <w:rPr>
-                        <w:sz w:val="14"/>
-                      </w:rPr>
-                      <w:t>y</w:t>
-                    </w:r>
-                    <w:r>
-                      <w:rPr>
-                        <w:rFonts w:ascii="Times New Roman" w:hAnsi="Times New Roman"/>
-                        <w:spacing w:val="9"/>
-                        <w:sz w:val="14"/>
-                      </w:rPr>
-                      <w:t xml:space="preserve"> </w:t>
-                    </w:r>
-                    <w:r>
-                      <w:rPr>
-                        <w:sz w:val="14"/>
-                      </w:rPr>
-                      <w:t>Reaseguros</w:t>
-                    </w:r>
-                    <w:r>
-                      <w:rPr>
-                        <w:rFonts w:ascii="Times New Roman" w:hAnsi="Times New Roman"/>
-                        <w:spacing w:val="9"/>
-                        <w:sz w:val="14"/>
-                      </w:rPr>
-                      <w:t xml:space="preserve"> </w:t>
-                    </w:r>
-                    <w:r>
-                      <w:rPr>
-                        <w:sz w:val="14"/>
-                      </w:rPr>
-                      <w:t>de</w:t>
-                    </w:r>
-                    <w:r>
-                      <w:rPr>
-                        <w:rFonts w:ascii="Times New Roman" w:hAnsi="Times New Roman"/>
-                        <w:spacing w:val="9"/>
-                        <w:sz w:val="14"/>
-                      </w:rPr>
-                      <w:t xml:space="preserve"> </w:t>
-                    </w:r>
-                    <w:r>
-                      <w:rPr>
-                        <w:spacing w:val="-2"/>
-                        <w:sz w:val="14"/>
-                      </w:rPr>
-                      <w:t>Panamá</w:t>
-                    </w:r>
-                  </w:p>
-                </w:txbxContent>
-              </v:textbox>
-              <w10:wrap anchorx="page" anchory="page"/>
-            </v:shape>
-          </w:pict>
-        </mc:Fallback>
-      </mc:AlternateContent>
+      <w:t xml:space="preserve"> | Tlf. 206-2021 | www.aseguradoraglobal.com.pa | info@aseguradoraglobal.com.pa</w:t>
     </w:r>
   </w:p>
 </w:ftr>
@@ -6131,7 +3358,68 @@
 
 <file path=word/header1.xml><?xml version="1.0" encoding="utf-8"?>
 <w:hdr xmlns:wpc="http://schemas.microsoft.com/office/word/2010/wordprocessingCanvas" xmlns:cx="http://schemas.microsoft.com/office/drawing/2014/chartex" xmlns:cx1="http://schemas.microsoft.com/office/drawing/2015/9/8/chartex" xmlns:cx2="http://schemas.microsoft.com/office/drawing/2015/10/21/chartex" xmlns:cx3="http://schemas.microsoft.com/office/drawing/2016/5/9/chartex" xmlns:cx4="http://schemas.microsoft.com/office/drawing/2016/5/10/chartex" xmlns:cx5="http://schemas.microsoft.com/office/drawing/2016/5/11/chartex" xmlns:cx6="http://schemas.microsoft.com/office/drawing/2016/5/12/chartex" xmlns:cx7="http://schemas.microsoft.com/office/drawing/2016/5/13/chartex" xmlns:cx8="http://schemas.microsoft.com/office/drawing/2016/5/14/chartex" xmlns:mc="http://schemas.openxmlformats.org/markup-compatibility/2006" xmlns:aink="http://schemas.microsoft.com/office/drawing/2016/ink" xmlns:am3d="http://schemas.microsoft.com/office/drawing/2017/model3d" xmlns:o="urn:schemas-microsoft-com:office:office" xmlns:oel="http://schemas.microsoft.com/office/2019/extlst" xmlns:r="http://schemas.openxmlformats.org/officeDocument/2006/relationships" xmlns:m="http://schemas.openxmlformats.org/officeDocument/2006/math" xmlns:v="urn:schemas-microsoft-com:vml" xmlns:wp14="http://schemas.microsoft.com/office/word/2010/wordprocessingDrawing" xmlns:wp="http://schemas.openxmlformats.org/drawingml/2006/wordprocessingDrawing" xmlns:w10="urn:schemas-microsoft-com:office:word" xmlns:w="http://schemas.openxmlformats.org/wordprocessingml/2006/main" xmlns:w14="http://schemas.microsoft.com/office/word/2010/wordml" xmlns:w15="http://schemas.microsoft.com/office/word/2012/wordml" xmlns:w16cex="http://schemas.microsoft.com/office/word/2018/wordml/cex" xmlns:w16cid="http://schemas.microsoft.com/office/word/2016/wordml/cid" xmlns:w16="http://schemas.microsoft.com/office/word/2018/wordml" xmlns:w16sdtdh="http://schemas.microsoft.com/office/word/2020/wordml/sdtdatahash" xmlns:w16se="http://schemas.microsoft.com/office/word/2015/wordml/symex" xmlns:wpg="http://schemas.microsoft.com/office/word/2010/wordprocessingGroup" xmlns:wpi="http://schemas.microsoft.com/office/word/2010/wordprocessingInk" xmlns:wne="http://schemas.microsoft.com/office/word/2006/wordml" xmlns:wps="http://schemas.microsoft.com/office/word/2010/wordprocessingShape" mc:Ignorable="w14 w15 w16se w16cid w16 w16cex w16sdtdh wp14">
-  <w:p/>
+  <w:p>
+    <w:r>
+      <w:rPr>
+        <w:noProof/>
+      </w:rPr>
+      <w:drawing>
+        <wp:anchor distT="0" distB="0" distL="114300" distR="114300" simplePos="0" relativeHeight="251658240" behindDoc="0" locked="0" layoutInCell="1" allowOverlap="1" wp14:anchorId="0DA27F8C" wp14:editId="4717EDA7">
+          <wp:simplePos x="0" y="0"/>
+          <wp:positionH relativeFrom="column">
+            <wp:posOffset>488950</wp:posOffset>
+          </wp:positionH>
+          <wp:positionV relativeFrom="paragraph">
+            <wp:posOffset>109855</wp:posOffset>
+          </wp:positionV>
+          <wp:extent cx="1756410" cy="590550"/>
+          <wp:effectExtent l="0" t="0" r="0" b="0"/>
+          <wp:wrapSquare wrapText="bothSides"/>
+          <wp:docPr id="535200157" name="logoGlobal" descr="Un conjunto de letras blancas en un fondo blanco&#10;&#10;Descripción generada automáticamente con confianza media"/>
+          <wp:cNvGraphicFramePr>
+            <a:graphicFrameLocks xmlns:a="http://schemas.openxmlformats.org/drawingml/2006/main" noChangeAspect="1"/>
+          </wp:cNvGraphicFramePr>
+          <a:graphic xmlns:a="http://schemas.openxmlformats.org/drawingml/2006/main">
+            <a:graphicData uri="http://schemas.openxmlformats.org/drawingml/2006/picture">
+              <pic:pic xmlns:pic="http://schemas.openxmlformats.org/drawingml/2006/picture">
+                <pic:nvPicPr>
+                  <pic:cNvPr id="535200157" name="logoGlobal" descr="Un conjunto de letras blancas en un fondo blanco&#10;&#10;Descripción generada automáticamente con confianza media"/>
+                  <pic:cNvPicPr/>
+                </pic:nvPicPr>
+                <pic:blipFill>
+                  <a:blip r:embed="rId1">
+                    <a:extLst>
+                      <a:ext uri="{28A0092B-C50C-407E-A947-70E740481C1C}">
+                        <a14:useLocalDpi xmlns:a14="http://schemas.microsoft.com/office/drawing/2010/main" val="0"/>
+                      </a:ext>
+                    </a:extLst>
+                  </a:blip>
+                  <a:stretch>
+                    <a:fillRect/>
+                  </a:stretch>
+                </pic:blipFill>
+                <pic:spPr>
+                  <a:xfrm>
+                    <a:off x="0" y="0"/>
+                    <a:ext cx="1756410" cy="590550"/>
+                  </a:xfrm>
+                  <a:prstGeom prst="rect">
+                    <a:avLst/>
+                  </a:prstGeom>
+                </pic:spPr>
+              </pic:pic>
+            </a:graphicData>
+          </a:graphic>
+          <wp14:sizeRelH relativeFrom="page">
+            <wp14:pctWidth>0</wp14:pctWidth>
+          </wp14:sizeRelH>
+          <wp14:sizeRelV relativeFrom="page">
+            <wp14:pctHeight>0</wp14:pctHeight>
+          </wp14:sizeRelV>
+        </wp:anchor>
+      </w:drawing>
+    </w:r>
+  </w:p>
   <w:tbl>
     <w:tblPr>
       <w:tblStyle w:val="Tablaconcuadrcula"/>

</xml_diff>